<commit_message>
release: v1.0.10 — ticket reconcile, detail/export, docs sync
Perbaiki logic duplicate Group ID/Name (HP vs master), detail ticket double-click + export Excel, reconcile realtime setelah scrape, dan selaraskan semua dokumentasi ke 1.0.10.

Co-authored-by: Cursor <cursoragent@cursor.com>
</commit_message>
<xml_diff>
--- a/docs/guides/documents/EN/Resource-Management-User-Guide-EN.docx
+++ b/docs/guides/documents/EN/Resource-Management-User-Guide-EN.docx
@@ -430,7 +430,7 @@
             </w:pPr>
             <w:r>
               <w:rPr/>
-              <w:t xml:space="preserve">0.1.1</w:t>
+              <w:t xml:space="preserve">1.0.10</w:t>
             </w:r>
           </w:p>
         </w:tc>
@@ -15851,7 +15851,7 @@
         <w:rPr>
           <w:b/>
         </w:rPr>
-        <w:t xml:space="preserve">0.1.1</w:t>
+        <w:t xml:space="preserve">1.0.10</w:t>
       </w:r>
       <w:r>
         <w:rPr/>
@@ -15864,7 +15864,7 @@
       </w:pPr>
       <w:r>
         <w:rPr/>
-        <w:t xml:space="preserve">Internal use only — Resource Management v0.1.1</w:t>
+        <w:t xml:space="preserve">Internal use only — Resource Management v1.0.10</w:t>
       </w:r>
     </w:p>
   </w:body>

</xml_diff>

<commit_message>
release: v1.0.11 — selaraskan ticket, grid, dan modal Admin vs master dengan engine master↔daily.
Co-authored-by: Cursor <cursoragent@cursor.com>
</commit_message>
<xml_diff>
--- a/docs/guides/documents/EN/Resource-Management-User-Guide-EN.docx
+++ b/docs/guides/documents/EN/Resource-Management-User-Guide-EN.docx
@@ -430,7 +430,7 @@
             </w:pPr>
             <w:r>
               <w:rPr/>
-              <w:t xml:space="preserve">1.0.10</w:t>
+              <w:t xml:space="preserve">1.0.11</w:t>
             </w:r>
           </w:p>
         </w:tc>
@@ -8160,7 +8160,7 @@
       </w:r>
       <w:r>
         <w:rPr/>
-        <w:t xml:space="preserve">.</w:t>
+        <w:t xml:space="preserve">. Choose a mode:</w:t>
       </w:r>
     </w:p>
     <w:tbl>
@@ -8203,26 +8203,26 @@
             </w:pPr>
             <w:r>
               <w:rPr/>
-              <w:t xml:space="preserve">Feature</w:t>
-            </w:r>
-          </w:p>
-        </w:tc>
-        <w:tc>
-          <w:tcPr>
-            <w:tcBorders>
-              <w:top w:val="single" w:sz="1" w:space="0" w:color="000000"/>
-              <w:bottom w:val="single" w:sz="1" w:space="0" w:color="000000"/>
-              <w:left w:val="single" w:sz="1" w:space="0" w:color="000000"/>
-              <w:right w:val="single" w:sz="1" w:space="0" w:color="000000"/>
-            </w:tcBorders>
-          </w:tcPr>
-          <w:p>
-            <w:pPr>
-              <w:spacing w:lineRule="auto"/>
-            </w:pPr>
-            <w:r>
-              <w:rPr/>
-              <w:t xml:space="preserve">Function</w:t>
+              <w:t xml:space="preserve">Mode</w:t>
+            </w:r>
+          </w:p>
+        </w:tc>
+        <w:tc>
+          <w:tcPr>
+            <w:tcBorders>
+              <w:top w:val="single" w:sz="1" w:space="0" w:color="000000"/>
+              <w:bottom w:val="single" w:sz="1" w:space="0" w:color="000000"/>
+              <w:left w:val="single" w:sz="1" w:space="0" w:color="000000"/>
+              <w:right w:val="single" w:sz="1" w:space="0" w:color="000000"/>
+            </w:tcBorders>
+          </w:tcPr>
+          <w:p>
+            <w:pPr>
+              <w:spacing w:lineRule="auto"/>
+            </w:pPr>
+            <w:r>
+              <w:rPr/>
+              <w:t xml:space="preserve">List contents</w:t>
             </w:r>
           </w:p>
         </w:tc>
@@ -8249,6 +8249,184 @@
               <w:spacing w:lineRule="auto"/>
             </w:pPr>
             <w:r>
+              <w:rPr>
+                <w:b/>
+              </w:rPr>
+              <w:t xml:space="preserve">Groups on this account</w:t>
+            </w:r>
+          </w:p>
+        </w:tc>
+        <w:tc>
+          <w:tcPr>
+            <w:tcBorders>
+              <w:top w:val="single" w:sz="1" w:space="0" w:color="000000"/>
+              <w:bottom w:val="single" w:sz="1" w:space="0" w:color="000000"/>
+              <w:left w:val="single" w:sz="1" w:space="0" w:color="000000"/>
+              <w:right w:val="single" w:sz="1" w:space="0" w:color="000000"/>
+            </w:tcBorders>
+          </w:tcPr>
+          <w:p>
+            <w:pPr>
+              <w:spacing w:lineRule="auto"/>
+            </w:pPr>
+            <w:r>
+              <w:rPr/>
+              <w:t xml:space="preserve">All groups on the device (Y) — daily scrape snapshot</w:t>
+            </w:r>
+          </w:p>
+        </w:tc>
+      </w:tr>
+      <w:tr>
+        <w:trPr>
+          <w:cantSplit/>
+        </w:trPr>
+        <w:tc>
+          <w:tcPr>
+            <w:tcBorders>
+              <w:top w:val="single" w:sz="1" w:space="0" w:color="000000"/>
+              <w:bottom w:val="single" w:sz="1" w:space="0" w:color="000000"/>
+              <w:left w:val="single" w:sz="1" w:space="0" w:color="000000"/>
+              <w:right w:val="single" w:sz="1" w:space="0" w:color="000000"/>
+            </w:tcBorders>
+          </w:tcPr>
+          <w:p>
+            <w:pPr>
+              <w:spacing w:lineRule="auto"/>
+            </w:pPr>
+            <w:r>
+              <w:rPr>
+                <w:b/>
+              </w:rPr>
+              <w:t xml:space="preserve">Admin vs master list</w:t>
+            </w:r>
+          </w:p>
+        </w:tc>
+        <w:tc>
+          <w:tcPr>
+            <w:tcBorders>
+              <w:top w:val="single" w:sz="1" w:space="0" w:color="000000"/>
+              <w:bottom w:val="single" w:sz="1" w:space="0" w:color="000000"/>
+              <w:left w:val="single" w:sz="1" w:space="0" w:color="000000"/>
+              <w:right w:val="single" w:sz="1" w:space="0" w:color="000000"/>
+            </w:tcBorders>
+          </w:tcPr>
+          <w:p>
+            <w:pPr>
+              <w:spacing w:lineRule="auto"/>
+            </w:pPr>
+            <w:r>
+              <w:rPr>
+                <w:b/>
+              </w:rPr>
+              <w:t xml:space="preserve">Brand master</w:t>
+            </w:r>
+          </w:p>
+          <w:p>
+            <w:pPr>
+              <w:spacing w:lineRule="auto"/>
+            </w:pPr>
+            <w:r>
+              <w:rPr/>
+              <w:t xml:space="preserve"> groups only (X) + this account’s admin/join status</w:t>
+            </w:r>
+          </w:p>
+        </w:tc>
+      </w:tr>
+    </w:tbl>
+    <w:p>
+      <w:pPr>
+        <w:spacing w:lineRule="auto"/>
+      </w:pPr>
+      <w:r>
+        <w:rPr/>
+      </w:r>
+    </w:p>
+    <w:tbl>
+      <w:tblPr>
+        <w:tblBorders>
+          <w:top w:val="single" w:sz="2" w:space="0" w:color="000000"/>
+          <w:bottom w:val="single" w:sz="2" w:space="0" w:color="000000"/>
+          <w:left w:val="single" w:sz="2" w:space="0" w:color="000000"/>
+          <w:right w:val="single" w:sz="2" w:space="0" w:color="000000"/>
+        </w:tblBorders>
+        <w:tblCellSpacing w:w="0" w:type="dxa"/>
+        <w:tblCellMar>
+          <w:top w:type="dxa" w:w="80"/>
+          <w:bottom w:type="dxa" w:w="80"/>
+          <w:left w:type="dxa" w:w="160"/>
+          <w:right w:type="dxa" w:w="160"/>
+        </w:tblCellMar>
+        <w:jc w:val="center"/>
+      </w:tblPr>
+      <w:tblGrid>
+        <w:gridCol w:w="4320"/>
+        <w:gridCol w:w="4320"/>
+      </w:tblGrid>
+      <w:tr>
+        <w:trPr>
+          <w:cantSplit/>
+        </w:trPr>
+        <w:tc>
+          <w:tcPr>
+            <w:tcBorders>
+              <w:top w:val="single" w:sz="1" w:space="0" w:color="000000"/>
+              <w:bottom w:val="single" w:sz="1" w:space="0" w:color="000000"/>
+              <w:left w:val="single" w:sz="1" w:space="0" w:color="000000"/>
+              <w:right w:val="single" w:sz="1" w:space="0" w:color="000000"/>
+            </w:tcBorders>
+          </w:tcPr>
+          <w:p>
+            <w:pPr>
+              <w:spacing w:lineRule="auto"/>
+            </w:pPr>
+            <w:r>
+              <w:rPr/>
+              <w:t xml:space="preserve">Feature</w:t>
+            </w:r>
+          </w:p>
+        </w:tc>
+        <w:tc>
+          <w:tcPr>
+            <w:tcBorders>
+              <w:top w:val="single" w:sz="1" w:space="0" w:color="000000"/>
+              <w:bottom w:val="single" w:sz="1" w:space="0" w:color="000000"/>
+              <w:left w:val="single" w:sz="1" w:space="0" w:color="000000"/>
+              <w:right w:val="single" w:sz="1" w:space="0" w:color="000000"/>
+            </w:tcBorders>
+          </w:tcPr>
+          <w:p>
+            <w:pPr>
+              <w:spacing w:lineRule="auto"/>
+            </w:pPr>
+            <w:r>
+              <w:rPr/>
+              <w:t xml:space="preserve">Function</w:t>
+            </w:r>
+          </w:p>
+        </w:tc>
+      </w:tr>
+      <w:tblGrid>
+        <w:gridCol w:w="4320"/>
+        <w:gridCol w:w="4320"/>
+      </w:tblGrid>
+      <w:tr>
+        <w:trPr>
+          <w:cantSplit/>
+        </w:trPr>
+        <w:tc>
+          <w:tcPr>
+            <w:tcBorders>
+              <w:top w:val="single" w:sz="1" w:space="0" w:color="000000"/>
+              <w:bottom w:val="single" w:sz="1" w:space="0" w:color="000000"/>
+              <w:left w:val="single" w:sz="1" w:space="0" w:color="000000"/>
+              <w:right w:val="single" w:sz="1" w:space="0" w:color="000000"/>
+            </w:tcBorders>
+          </w:tcPr>
+          <w:p>
+            <w:pPr>
+              <w:spacing w:lineRule="auto"/>
+            </w:pPr>
+            <w:r>
               <w:rPr/>
               <w:t xml:space="preserve">Table</w:t>
             </w:r>
@@ -8360,49 +8538,6 @@
           </w:p>
         </w:tc>
       </w:tr>
-      <w:tr>
-        <w:trPr>
-          <w:cantSplit/>
-        </w:trPr>
-        <w:tc>
-          <w:tcPr>
-            <w:tcBorders>
-              <w:top w:val="single" w:sz="1" w:space="0" w:color="000000"/>
-              <w:bottom w:val="single" w:sz="1" w:space="0" w:color="000000"/>
-              <w:left w:val="single" w:sz="1" w:space="0" w:color="000000"/>
-              <w:right w:val="single" w:sz="1" w:space="0" w:color="000000"/>
-            </w:tcBorders>
-          </w:tcPr>
-          <w:p>
-            <w:pPr>
-              <w:spacing w:lineRule="auto"/>
-            </w:pPr>
-            <w:r>
-              <w:rPr/>
-              <w:t xml:space="preserve">Scroll</w:t>
-            </w:r>
-          </w:p>
-        </w:tc>
-        <w:tc>
-          <w:tcPr>
-            <w:tcBorders>
-              <w:top w:val="single" w:sz="1" w:space="0" w:color="000000"/>
-              <w:bottom w:val="single" w:sz="1" w:space="0" w:color="000000"/>
-              <w:left w:val="single" w:sz="1" w:space="0" w:color="000000"/>
-              <w:right w:val="single" w:sz="1" w:space="0" w:color="000000"/>
-            </w:tcBorders>
-          </w:tcPr>
-          <w:p>
-            <w:pPr>
-              <w:spacing w:lineRule="auto"/>
-            </w:pPr>
-            <w:r>
-              <w:rPr/>
-              <w:t xml:space="preserve">Scroll inside table (viewport hint for large pages)</w:t>
-            </w:r>
-          </w:p>
-        </w:tc>
-      </w:tr>
     </w:tbl>
     <w:p>
       <w:pPr>
@@ -8410,6 +8545,41 @@
       </w:pPr>
       <w:r>
         <w:rPr/>
+      </w:r>
+    </w:p>
+    <w:p>
+      <w:pPr>
+        <w:spacing w:lineRule="auto"/>
+      </w:pPr>
+      <w:r>
+        <w:rPr>
+          <w:b/>
+        </w:rPr>
+        <w:t xml:space="preserve">Admin vs master</w:t>
+      </w:r>
+      <w:r>
+        <w:rPr/>
+        <w:t xml:space="preserve"> total matches the Groups/Admin denominator (X) and the </w:t>
+      </w:r>
+      <w:r>
+        <w:rPr>
+          <w:b/>
+        </w:rPr>
+        <w:t xml:space="preserve">WA x Group</w:t>
+      </w:r>
+      <w:r>
+        <w:rPr/>
+        <w:t xml:space="preserve"> badge — device junk groups are </w:t>
+      </w:r>
+      <w:r>
+        <w:rPr>
+          <w:b/>
+        </w:rPr>
+        <w:t xml:space="preserve">not</w:t>
+      </w:r>
+      <w:r>
+        <w:rPr/>
+        <w:t xml:space="preserve"> listed here (see Tickets → Junk).</w:t>
       </w:r>
     </w:p>
     <w:p>
@@ -9376,6 +9546,25 @@
     </w:p>
     <w:p>
       <w:pPr>
+        <w:spacing w:lineRule="auto"/>
+      </w:pPr>
+      <w:r>
+        <w:rPr/>
+        <w:t xml:space="preserve">Ticket card counts use the </w:t>
+      </w:r>
+      <w:r>
+        <w:rPr>
+          <w:b/>
+        </w:rPr>
+        <w:t xml:space="preserve">same engine</w:t>
+      </w:r>
+      <w:r>
+        <w:rPr/>
+        <w:t xml:space="preserve"> as the Groups/Admin columns on the Account tab — not raw database row counts.</w:t>
+      </w:r>
+    </w:p>
+    <w:p>
+      <w:pPr>
         <w:pStyle w:val="Heading3"/>
         <w:spacing w:lineRule="auto"/>
       </w:pPr>
@@ -15851,7 +16040,7 @@
         <w:rPr>
           <w:b/>
         </w:rPr>
-        <w:t xml:space="preserve">1.0.10</w:t>
+        <w:t xml:space="preserve">1.0.11</w:t>
       </w:r>
       <w:r>
         <w:rPr/>
@@ -15864,7 +16053,7 @@
       </w:pPr>
       <w:r>
         <w:rPr/>
-        <w:t xml:space="preserve">Internal use only — Resource Management v1.0.10</w:t>
+        <w:t xml:space="preserve">Internal use only — Resource Management v1.0.11</w:t>
       </w:r>
     </w:p>
   </w:body>

</xml_diff>

<commit_message>
feat(session): Clear Session, warna ratio In brand/Admin, dan docs v1.0.14.
Tombol X hover pada session Valid memutus rantai WA lokal + invalidate DB. MetricRatioLabel: Y merah jika kurang dari X, hijau jika sama. Dokumentasi, handbook EN/ZH, dan validator clear-session diperbarui.

Co-authored-by: Cursor <cursoragent@cursor.com>
</commit_message>
<xml_diff>
--- a/docs/guides/documents/EN/Resource-Management-User-Guide-EN.docx
+++ b/docs/guides/documents/EN/Resource-Management-User-Guide-EN.docx
@@ -42,255 +42,6 @@
       <w:r>
         <w:rPr/>
         <w:t xml:space="preserve">Official User Guide</w:t>
-      </w:r>
-    </w:p>
-    <w:tbl>
-      <w:tblPr>
-        <w:tblBorders>
-          <w:top w:val="single" w:sz="2" w:space="0" w:color="000000"/>
-          <w:bottom w:val="single" w:sz="2" w:space="0" w:color="000000"/>
-          <w:left w:val="single" w:sz="2" w:space="0" w:color="000000"/>
-          <w:right w:val="single" w:sz="2" w:space="0" w:color="000000"/>
-        </w:tblBorders>
-        <w:tblCellSpacing w:w="0" w:type="dxa"/>
-        <w:tblCellMar>
-          <w:top w:type="dxa" w:w="80"/>
-          <w:bottom w:type="dxa" w:w="80"/>
-          <w:left w:type="dxa" w:w="160"/>
-          <w:right w:type="dxa" w:w="160"/>
-        </w:tblCellMar>
-        <w:jc w:val="center"/>
-      </w:tblPr>
-    </w:tbl>
-    <w:p>
-      <w:pPr>
-        <w:spacing w:lineRule="auto"/>
-      </w:pPr>
-      <w:r>
-        <w:rPr/>
-      </w:r>
-    </w:p>
-    <w:p>
-      <w:pPr>
-        <w:spacing w:lineRule="auto"/>
-      </w:pPr>
-      <w:r>
-        <w:rPr/>
-        <w:t xml:space="preserve">Table of contents</w:t>
-      </w:r>
-    </w:p>
-    <w:p>
-      <w:pPr>
-        <w:numPr>
-          <w:ilvl w:val="0"/>
-          <w:numId w:val="1"/>
-        </w:numPr>
-        <w:spacing w:lineRule="auto"/>
-      </w:pPr>
-      <w:hyperlink r:id="rId6">
-        <w:r>
-          <w:rPr>
-            <w:rStyle w:val="Hyperlink"/>
-          </w:rPr>
-          <w:t xml:space="preserve">Table of contents</w:t>
-        </w:r>
-      </w:hyperlink>
-    </w:p>
-    <w:p>
-      <w:pPr>
-        <w:numPr>
-          <w:ilvl w:val="0"/>
-          <w:numId w:val="1"/>
-        </w:numPr>
-        <w:spacing w:lineRule="auto"/>
-      </w:pPr>
-      <w:hyperlink r:id="rId7">
-        <w:r>
-          <w:rPr>
-            <w:rStyle w:val="Hyperlink"/>
-          </w:rPr>
-          <w:t xml:space="preserve">1. Overview</w:t>
-        </w:r>
-      </w:hyperlink>
-    </w:p>
-    <w:p>
-      <w:pPr>
-        <w:numPr>
-          <w:ilvl w:val="0"/>
-          <w:numId w:val="1"/>
-        </w:numPr>
-        <w:spacing w:lineRule="auto"/>
-      </w:pPr>
-      <w:hyperlink r:id="rId8">
-        <w:r>
-          <w:rPr>
-            <w:rStyle w:val="Hyperlink"/>
-          </w:rPr>
-          <w:t xml:space="preserve">2. Getting started</w:t>
-        </w:r>
-      </w:hyperlink>
-    </w:p>
-    <w:p>
-      <w:pPr>
-        <w:numPr>
-          <w:ilvl w:val="0"/>
-          <w:numId w:val="1"/>
-        </w:numPr>
-        <w:spacing w:lineRule="auto"/>
-      </w:pPr>
-      <w:hyperlink r:id="rId9">
-        <w:r>
-          <w:rPr>
-            <w:rStyle w:val="Hyperlink"/>
-          </w:rPr>
-          <w:t xml:space="preserve">3. Navigation and layout</w:t>
-        </w:r>
-      </w:hyperlink>
-    </w:p>
-    <w:p>
-      <w:pPr>
-        <w:numPr>
-          <w:ilvl w:val="0"/>
-          <w:numId w:val="1"/>
-        </w:numPr>
-        <w:spacing w:lineRule="auto"/>
-      </w:pPr>
-      <w:hyperlink r:id="rId10">
-        <w:r>
-          <w:rPr>
-            <w:rStyle w:val="Hyperlink"/>
-          </w:rPr>
-          <w:t xml:space="preserve">4. Account tab — account monitoring</w:t>
-        </w:r>
-      </w:hyperlink>
-    </w:p>
-    <w:p>
-      <w:pPr>
-        <w:numPr>
-          <w:ilvl w:val="0"/>
-          <w:numId w:val="1"/>
-        </w:numPr>
-        <w:spacing w:lineRule="auto"/>
-      </w:pPr>
-      <w:hyperlink r:id="rId11">
-        <w:r>
-          <w:rPr>
-            <w:rStyle w:val="Hyperlink"/>
-          </w:rPr>
-          <w:t xml:space="preserve">5. Ticket tab — issues and remediation</w:t>
-        </w:r>
-      </w:hyperlink>
-    </w:p>
-    <w:p>
-      <w:pPr>
-        <w:numPr>
-          <w:ilvl w:val="0"/>
-          <w:numId w:val="1"/>
-        </w:numPr>
-        <w:spacing w:lineRule="auto"/>
-      </w:pPr>
-      <w:hyperlink r:id="rId12">
-        <w:r>
-          <w:rPr>
-            <w:rStyle w:val="Hyperlink"/>
-          </w:rPr>
-          <w:t xml:space="preserve">6. Admin page</w:t>
-        </w:r>
-      </w:hyperlink>
-    </w:p>
-    <w:p>
-      <w:pPr>
-        <w:numPr>
-          <w:ilvl w:val="0"/>
-          <w:numId w:val="1"/>
-        </w:numPr>
-        <w:spacing w:lineRule="auto"/>
-      </w:pPr>
-      <w:hyperlink r:id="rId13">
-        <w:r>
-          <w:rPr>
-            <w:rStyle w:val="Hyperlink"/>
-          </w:rPr>
-          <w:t xml:space="preserve">7. Data synchronization (realtime)</w:t>
-        </w:r>
-      </w:hyperlink>
-    </w:p>
-    <w:p>
-      <w:pPr>
-        <w:numPr>
-          <w:ilvl w:val="0"/>
-          <w:numId w:val="1"/>
-        </w:numPr>
-        <w:spacing w:lineRule="auto"/>
-      </w:pPr>
-      <w:hyperlink r:id="rId14">
-        <w:r>
-          <w:rPr>
-            <w:rStyle w:val="Hyperlink"/>
-          </w:rPr>
-          <w:t xml:space="preserve">8. Recommended daily workflows</w:t>
-        </w:r>
-      </w:hyperlink>
-    </w:p>
-    <w:p>
-      <w:pPr>
-        <w:numPr>
-          <w:ilvl w:val="0"/>
-          <w:numId w:val="1"/>
-        </w:numPr>
-        <w:spacing w:lineRule="auto"/>
-      </w:pPr>
-      <w:hyperlink r:id="rId15">
-        <w:r>
-          <w:rPr>
-            <w:rStyle w:val="Hyperlink"/>
-          </w:rPr>
-          <w:t xml:space="preserve">9. Glossary</w:t>
-        </w:r>
-      </w:hyperlink>
-    </w:p>
-    <w:p>
-      <w:pPr>
-        <w:numPr>
-          <w:ilvl w:val="0"/>
-          <w:numId w:val="1"/>
-        </w:numPr>
-        <w:spacing w:lineRule="auto"/>
-      </w:pPr>
-      <w:hyperlink r:id="rId16">
-        <w:r>
-          <w:rPr>
-            <w:rStyle w:val="Hyperlink"/>
-          </w:rPr>
-          <w:t xml:space="preserve">10. FAQ</w:t>
-        </w:r>
-      </w:hyperlink>
-    </w:p>
-    <w:p>
-      <w:pPr>
-        <w:numPr>
-          <w:ilvl w:val="0"/>
-          <w:numId w:val="1"/>
-        </w:numPr>
-        <w:spacing w:lineRule="auto"/>
-      </w:pPr>
-      <w:hyperlink r:id="rId17">
-        <w:r>
-          <w:rPr>
-            <w:rStyle w:val="Hyperlink"/>
-          </w:rPr>
-          <w:t xml:space="preserve">Appendix — Quick feature map</w:t>
-        </w:r>
-      </w:hyperlink>
-    </w:p>
-    <w:p>
-      <w:pPr>
-        <w:pStyle w:val="Heading1"/>
-        <w:spacing w:lineRule="auto"/>
-      </w:pPr>
-      <w:r>
-        <w:rPr/>
-        <w:t xml:space="preserve">Resource Management — Official User Guide (English)</w:t>
       </w:r>
     </w:p>
     <w:tbl>
@@ -327,45 +78,12 @@
               <w:right w:val="single" w:sz="1" w:space="0" w:color="000000"/>
             </w:tcBorders>
           </w:tcPr>
-          <w:p/>
-        </w:tc>
-        <w:tc>
-          <w:tcPr>
-            <w:tcBorders>
-              <w:top w:val="single" w:sz="1" w:space="0" w:color="000000"/>
-              <w:bottom w:val="single" w:sz="1" w:space="0" w:color="000000"/>
-              <w:left w:val="single" w:sz="1" w:space="0" w:color="000000"/>
-              <w:right w:val="single" w:sz="1" w:space="0" w:color="000000"/>
-            </w:tcBorders>
-          </w:tcPr>
-          <w:p/>
-        </w:tc>
-      </w:tr>
-      <w:tblGrid>
-        <w:gridCol w:w="4320"/>
-        <w:gridCol w:w="4320"/>
-      </w:tblGrid>
-      <w:tr>
-        <w:trPr>
-          <w:cantSplit/>
-        </w:trPr>
-        <w:tc>
-          <w:tcPr>
-            <w:tcBorders>
-              <w:top w:val="single" w:sz="1" w:space="0" w:color="000000"/>
-              <w:bottom w:val="single" w:sz="1" w:space="0" w:color="000000"/>
-              <w:left w:val="single" w:sz="1" w:space="0" w:color="000000"/>
-              <w:right w:val="single" w:sz="1" w:space="0" w:color="000000"/>
-            </w:tcBorders>
-          </w:tcPr>
-          <w:p>
-            <w:pPr>
-              <w:spacing w:lineRule="auto"/>
-            </w:pPr>
-            <w:r>
-              <w:rPr>
-                <w:b/>
-              </w:rPr>
+          <w:p>
+            <w:pPr>
+              <w:spacing w:lineRule="auto"/>
+            </w:pPr>
+            <w:r>
+              <w:rPr/>
               <w:t xml:space="preserve">Product</w:t>
             </w:r>
           </w:p>
@@ -408,9 +126,7 @@
               <w:spacing w:lineRule="auto"/>
             </w:pPr>
             <w:r>
-              <w:rPr>
-                <w:b/>
-              </w:rPr>
+              <w:rPr/>
               <w:t xml:space="preserve">App version</w:t>
             </w:r>
           </w:p>
@@ -430,32 +146,30 @@
             </w:pPr>
             <w:r>
               <w:rPr/>
-              <w:t xml:space="preserve">1.0.11</w:t>
-            </w:r>
-          </w:p>
-        </w:tc>
-      </w:tr>
-      <w:tr>
-        <w:trPr>
-          <w:cantSplit/>
-        </w:trPr>
-        <w:tc>
-          <w:tcPr>
-            <w:tcBorders>
-              <w:top w:val="single" w:sz="1" w:space="0" w:color="000000"/>
-              <w:bottom w:val="single" w:sz="1" w:space="0" w:color="000000"/>
-              <w:left w:val="single" w:sz="1" w:space="0" w:color="000000"/>
-              <w:right w:val="single" w:sz="1" w:space="0" w:color="000000"/>
-            </w:tcBorders>
-          </w:tcPr>
-          <w:p>
-            <w:pPr>
-              <w:spacing w:lineRule="auto"/>
-            </w:pPr>
-            <w:r>
-              <w:rPr>
-                <w:b/>
-              </w:rPr>
+              <w:t xml:space="preserve">1.0.14</w:t>
+            </w:r>
+          </w:p>
+        </w:tc>
+      </w:tr>
+      <w:tr>
+        <w:trPr>
+          <w:cantSplit/>
+        </w:trPr>
+        <w:tc>
+          <w:tcPr>
+            <w:tcBorders>
+              <w:top w:val="single" w:sz="1" w:space="0" w:color="000000"/>
+              <w:bottom w:val="single" w:sz="1" w:space="0" w:color="000000"/>
+              <w:left w:val="single" w:sz="1" w:space="0" w:color="000000"/>
+              <w:right w:val="single" w:sz="1" w:space="0" w:color="000000"/>
+            </w:tcBorders>
+          </w:tcPr>
+          <w:p>
+            <w:pPr>
+              <w:spacing w:lineRule="auto"/>
+            </w:pPr>
+            <w:r>
+              <w:rPr/>
               <w:t xml:space="preserve">Audience</w:t>
             </w:r>
           </w:p>
@@ -498,9 +212,7 @@
               <w:spacing w:lineRule="auto"/>
             </w:pPr>
             <w:r>
-              <w:rPr>
-                <w:b/>
-              </w:rPr>
+              <w:rPr/>
               <w:t xml:space="preserve">Platform</w:t>
             </w:r>
           </w:p>
@@ -520,52 +232,30 @@
             </w:pPr>
             <w:r>
               <w:rPr/>
-              <w:t xml:space="preserve">Windows desktop (</w:t>
-            </w:r>
-          </w:p>
-          <w:p>
-            <w:pPr>
-              <w:spacing w:lineRule="auto"/>
-            </w:pPr>
-            <w:r>
-              <w:rPr>
-                <w:highlight w:val="lightGray"/>
-              </w:rPr>
-              <w:t xml:space="preserve">.exe</w:t>
-            </w:r>
-          </w:p>
-          <w:p>
-            <w:pPr>
-              <w:spacing w:lineRule="auto"/>
-            </w:pPr>
-            <w:r>
-              <w:rPr/>
-              <w:t xml:space="preserve">)</w:t>
-            </w:r>
-          </w:p>
-        </w:tc>
-      </w:tr>
-      <w:tr>
-        <w:trPr>
-          <w:cantSplit/>
-        </w:trPr>
-        <w:tc>
-          <w:tcPr>
-            <w:tcBorders>
-              <w:top w:val="single" w:sz="1" w:space="0" w:color="000000"/>
-              <w:bottom w:val="single" w:sz="1" w:space="0" w:color="000000"/>
-              <w:left w:val="single" w:sz="1" w:space="0" w:color="000000"/>
-              <w:right w:val="single" w:sz="1" w:space="0" w:color="000000"/>
-            </w:tcBorders>
-          </w:tcPr>
-          <w:p>
-            <w:pPr>
-              <w:spacing w:lineRule="auto"/>
-            </w:pPr>
-            <w:r>
-              <w:rPr>
-                <w:b/>
-              </w:rPr>
+              <w:t xml:space="preserve">Windows / macOS / Linux desktop installers</w:t>
+            </w:r>
+          </w:p>
+        </w:tc>
+      </w:tr>
+      <w:tr>
+        <w:trPr>
+          <w:cantSplit/>
+        </w:trPr>
+        <w:tc>
+          <w:tcPr>
+            <w:tcBorders>
+              <w:top w:val="single" w:sz="1" w:space="0" w:color="000000"/>
+              <w:bottom w:val="single" w:sz="1" w:space="0" w:color="000000"/>
+              <w:left w:val="single" w:sz="1" w:space="0" w:color="000000"/>
+              <w:right w:val="single" w:sz="1" w:space="0" w:color="000000"/>
+            </w:tcBorders>
+          </w:tcPr>
+          <w:p>
+            <w:pPr>
+              <w:spacing w:lineRule="auto"/>
+            </w:pPr>
+            <w:r>
+              <w:rPr/>
               <w:t xml:space="preserve">UI languages</w:t>
             </w:r>
           </w:p>
@@ -598,6 +288,219 @@
       <w:r>
         <w:rPr/>
       </w:r>
+    </w:p>
+    <w:p>
+      <w:pPr>
+        <w:spacing w:lineRule="auto"/>
+      </w:pPr>
+      <w:r>
+        <w:rPr/>
+        <w:t xml:space="preserve">Table of contents</w:t>
+      </w:r>
+    </w:p>
+    <w:p>
+      <w:pPr>
+        <w:numPr>
+          <w:ilvl w:val="0"/>
+          <w:numId w:val="1"/>
+        </w:numPr>
+        <w:spacing w:lineRule="auto"/>
+      </w:pPr>
+      <w:hyperlink r:id="rId6">
+        <w:r>
+          <w:rPr>
+            <w:rStyle w:val="Hyperlink"/>
+          </w:rPr>
+          <w:t xml:space="preserve">Table of contents</w:t>
+        </w:r>
+      </w:hyperlink>
+    </w:p>
+    <w:p>
+      <w:pPr>
+        <w:numPr>
+          <w:ilvl w:val="0"/>
+          <w:numId w:val="1"/>
+        </w:numPr>
+        <w:spacing w:lineRule="auto"/>
+      </w:pPr>
+      <w:hyperlink r:id="rId7">
+        <w:r>
+          <w:rPr>
+            <w:rStyle w:val="Hyperlink"/>
+          </w:rPr>
+          <w:t xml:space="preserve">1. Overview</w:t>
+        </w:r>
+      </w:hyperlink>
+    </w:p>
+    <w:p>
+      <w:pPr>
+        <w:numPr>
+          <w:ilvl w:val="0"/>
+          <w:numId w:val="1"/>
+        </w:numPr>
+        <w:spacing w:lineRule="auto"/>
+      </w:pPr>
+      <w:hyperlink r:id="rId8">
+        <w:r>
+          <w:rPr>
+            <w:rStyle w:val="Hyperlink"/>
+          </w:rPr>
+          <w:t xml:space="preserve">2. Getting started</w:t>
+        </w:r>
+      </w:hyperlink>
+    </w:p>
+    <w:p>
+      <w:pPr>
+        <w:numPr>
+          <w:ilvl w:val="0"/>
+          <w:numId w:val="1"/>
+        </w:numPr>
+        <w:spacing w:lineRule="auto"/>
+      </w:pPr>
+      <w:hyperlink r:id="rId9">
+        <w:r>
+          <w:rPr>
+            <w:rStyle w:val="Hyperlink"/>
+          </w:rPr>
+          <w:t xml:space="preserve">3. Navigation and layout</w:t>
+        </w:r>
+      </w:hyperlink>
+    </w:p>
+    <w:p>
+      <w:pPr>
+        <w:numPr>
+          <w:ilvl w:val="0"/>
+          <w:numId w:val="1"/>
+        </w:numPr>
+        <w:spacing w:lineRule="auto"/>
+      </w:pPr>
+      <w:hyperlink r:id="rId10">
+        <w:r>
+          <w:rPr>
+            <w:rStyle w:val="Hyperlink"/>
+          </w:rPr>
+          <w:t xml:space="preserve">4. Account tab — account monitoring</w:t>
+        </w:r>
+      </w:hyperlink>
+    </w:p>
+    <w:p>
+      <w:pPr>
+        <w:numPr>
+          <w:ilvl w:val="0"/>
+          <w:numId w:val="1"/>
+        </w:numPr>
+        <w:spacing w:lineRule="auto"/>
+      </w:pPr>
+      <w:hyperlink r:id="rId11">
+        <w:r>
+          <w:rPr>
+            <w:rStyle w:val="Hyperlink"/>
+          </w:rPr>
+          <w:t xml:space="preserve">5. Ticket tab — issues and remediation</w:t>
+        </w:r>
+      </w:hyperlink>
+    </w:p>
+    <w:p>
+      <w:pPr>
+        <w:numPr>
+          <w:ilvl w:val="0"/>
+          <w:numId w:val="1"/>
+        </w:numPr>
+        <w:spacing w:lineRule="auto"/>
+      </w:pPr>
+      <w:hyperlink r:id="rId12">
+        <w:r>
+          <w:rPr>
+            <w:rStyle w:val="Hyperlink"/>
+          </w:rPr>
+          <w:t xml:space="preserve">6. Admin page</w:t>
+        </w:r>
+      </w:hyperlink>
+    </w:p>
+    <w:p>
+      <w:pPr>
+        <w:numPr>
+          <w:ilvl w:val="0"/>
+          <w:numId w:val="1"/>
+        </w:numPr>
+        <w:spacing w:lineRule="auto"/>
+      </w:pPr>
+      <w:hyperlink r:id="rId13">
+        <w:r>
+          <w:rPr>
+            <w:rStyle w:val="Hyperlink"/>
+          </w:rPr>
+          <w:t xml:space="preserve">7. Data synchronization (realtime)</w:t>
+        </w:r>
+      </w:hyperlink>
+    </w:p>
+    <w:p>
+      <w:pPr>
+        <w:numPr>
+          <w:ilvl w:val="0"/>
+          <w:numId w:val="1"/>
+        </w:numPr>
+        <w:spacing w:lineRule="auto"/>
+      </w:pPr>
+      <w:hyperlink r:id="rId14">
+        <w:r>
+          <w:rPr>
+            <w:rStyle w:val="Hyperlink"/>
+          </w:rPr>
+          <w:t xml:space="preserve">8. Recommended daily workflows</w:t>
+        </w:r>
+      </w:hyperlink>
+    </w:p>
+    <w:p>
+      <w:pPr>
+        <w:numPr>
+          <w:ilvl w:val="0"/>
+          <w:numId w:val="1"/>
+        </w:numPr>
+        <w:spacing w:lineRule="auto"/>
+      </w:pPr>
+      <w:hyperlink r:id="rId15">
+        <w:r>
+          <w:rPr>
+            <w:rStyle w:val="Hyperlink"/>
+          </w:rPr>
+          <w:t xml:space="preserve">9. Glossary</w:t>
+        </w:r>
+      </w:hyperlink>
+    </w:p>
+    <w:p>
+      <w:pPr>
+        <w:numPr>
+          <w:ilvl w:val="0"/>
+          <w:numId w:val="1"/>
+        </w:numPr>
+        <w:spacing w:lineRule="auto"/>
+      </w:pPr>
+      <w:hyperlink r:id="rId16">
+        <w:r>
+          <w:rPr>
+            <w:rStyle w:val="Hyperlink"/>
+          </w:rPr>
+          <w:t xml:space="preserve">10. FAQ</w:t>
+        </w:r>
+      </w:hyperlink>
+    </w:p>
+    <w:p>
+      <w:pPr>
+        <w:numPr>
+          <w:ilvl w:val="0"/>
+          <w:numId w:val="1"/>
+        </w:numPr>
+        <w:spacing w:lineRule="auto"/>
+      </w:pPr>
+      <w:hyperlink r:id="rId17">
+        <w:r>
+          <w:rPr>
+            <w:rStyle w:val="Hyperlink"/>
+          </w:rPr>
+          <w:t xml:space="preserve">Appendix — Quick feature map</w:t>
+        </w:r>
+      </w:hyperlink>
     </w:p>
     <w:p>
       <w:pPr>
@@ -5302,27 +5205,7 @@
             </w:pPr>
             <w:r>
               <w:rPr/>
-              <w:t xml:space="preserve">Hide card for </w:t>
-            </w:r>
-          </w:p>
-          <w:p>
-            <w:pPr>
-              <w:spacing w:lineRule="auto"/>
-            </w:pPr>
-            <w:r>
-              <w:rPr>
-                <w:b/>
-              </w:rPr>
-              <w:t xml:space="preserve">this session only</w:t>
-            </w:r>
-          </w:p>
-          <w:p>
-            <w:pPr>
-              <w:spacing w:lineRule="auto"/>
-            </w:pPr>
-            <w:r>
-              <w:rPr/>
-              <w:t xml:space="preserve"> — does not delete database data</w:t>
+              <w:t xml:space="preserve">Remove brand from database (confirmation modal)</w:t>
             </w:r>
           </w:p>
         </w:tc>
@@ -6187,7 +6070,38 @@
             </w:pPr>
             <w:r>
               <w:rPr/>
-              <w:t xml:space="preserve">Invalid → platform login required first</w:t>
+              <w:t xml:space="preserve">Invalid → login first; </w:t>
+            </w:r>
+          </w:p>
+          <w:p>
+            <w:pPr>
+              <w:spacing w:lineRule="auto"/>
+            </w:pPr>
+            <w:r>
+              <w:rPr>
+                <w:b/>
+              </w:rPr>
+              <w:t xml:space="preserve">X on hover</w:t>
+            </w:r>
+          </w:p>
+          <w:p>
+            <w:pPr>
+              <w:spacing w:lineRule="auto"/>
+            </w:pPr>
+            <w:r>
+              <w:rPr/>
+              <w:t xml:space="preserve"> when Valid = </w:t>
+            </w:r>
+          </w:p>
+          <w:p>
+            <w:pPr>
+              <w:spacing w:lineRule="auto"/>
+            </w:pPr>
+            <w:r>
+              <w:rPr>
+                <w:b/>
+              </w:rPr>
+              <w:t xml:space="preserve">Clear Session</w:t>
             </w:r>
           </w:p>
         </w:tc>
@@ -6254,6 +6168,136 @@
             <w:r>
               <w:rPr/>
               <w:t xml:space="preserve">Y = groups on device today; X = brand standard for same platform</w:t>
+            </w:r>
+          </w:p>
+        </w:tc>
+      </w:tr>
+      <w:tr>
+        <w:trPr>
+          <w:cantSplit/>
+        </w:trPr>
+        <w:tc>
+          <w:tcPr>
+            <w:tcBorders>
+              <w:top w:val="single" w:sz="1" w:space="0" w:color="000000"/>
+              <w:bottom w:val="single" w:sz="1" w:space="0" w:color="000000"/>
+              <w:left w:val="single" w:sz="1" w:space="0" w:color="000000"/>
+              <w:right w:val="single" w:sz="1" w:space="0" w:color="000000"/>
+            </w:tcBorders>
+          </w:tcPr>
+          <w:p>
+            <w:pPr>
+              <w:spacing w:lineRule="auto"/>
+            </w:pPr>
+            <w:r>
+              <w:rPr>
+                <w:b/>
+              </w:rPr>
+              <w:t xml:space="preserve">On device</w:t>
+            </w:r>
+          </w:p>
+        </w:tc>
+        <w:tc>
+          <w:tcPr>
+            <w:tcBorders>
+              <w:top w:val="single" w:sz="1" w:space="0" w:color="000000"/>
+              <w:bottom w:val="single" w:sz="1" w:space="0" w:color="000000"/>
+              <w:left w:val="single" w:sz="1" w:space="0" w:color="000000"/>
+              <w:right w:val="single" w:sz="1" w:space="0" w:color="000000"/>
+            </w:tcBorders>
+          </w:tcPr>
+          <w:p>
+            <w:pPr>
+              <w:spacing w:lineRule="auto"/>
+            </w:pPr>
+            <w:r>
+              <w:rPr/>
+              <w:t xml:space="preserve">Single number</w:t>
+            </w:r>
+          </w:p>
+        </w:tc>
+        <w:tc>
+          <w:tcPr>
+            <w:tcBorders>
+              <w:top w:val="single" w:sz="1" w:space="0" w:color="000000"/>
+              <w:bottom w:val="single" w:sz="1" w:space="0" w:color="000000"/>
+              <w:left w:val="single" w:sz="1" w:space="0" w:color="000000"/>
+              <w:right w:val="single" w:sz="1" w:space="0" w:color="000000"/>
+            </w:tcBorders>
+          </w:tcPr>
+          <w:p>
+            <w:pPr>
+              <w:spacing w:lineRule="auto"/>
+            </w:pPr>
+            <w:r>
+              <w:rPr/>
+              <w:t xml:space="preserve">Total groups on phone/PC (daily)</w:t>
+            </w:r>
+          </w:p>
+        </w:tc>
+      </w:tr>
+      <w:tr>
+        <w:trPr>
+          <w:cantSplit/>
+        </w:trPr>
+        <w:tc>
+          <w:tcPr>
+            <w:tcBorders>
+              <w:top w:val="single" w:sz="1" w:space="0" w:color="000000"/>
+              <w:bottom w:val="single" w:sz="1" w:space="0" w:color="000000"/>
+              <w:left w:val="single" w:sz="1" w:space="0" w:color="000000"/>
+              <w:right w:val="single" w:sz="1" w:space="0" w:color="000000"/>
+            </w:tcBorders>
+          </w:tcPr>
+          <w:p>
+            <w:pPr>
+              <w:spacing w:lineRule="auto"/>
+            </w:pPr>
+            <w:r>
+              <w:rPr>
+                <w:b/>
+              </w:rPr>
+              <w:t xml:space="preserve">In brand</w:t>
+            </w:r>
+          </w:p>
+        </w:tc>
+        <w:tc>
+          <w:tcPr>
+            <w:tcBorders>
+              <w:top w:val="single" w:sz="1" w:space="0" w:color="000000"/>
+              <w:bottom w:val="single" w:sz="1" w:space="0" w:color="000000"/>
+              <w:left w:val="single" w:sz="1" w:space="0" w:color="000000"/>
+              <w:right w:val="single" w:sz="1" w:space="0" w:color="000000"/>
+            </w:tcBorders>
+          </w:tcPr>
+          <w:p>
+            <w:pPr>
+              <w:spacing w:lineRule="auto"/>
+            </w:pPr>
+            <w:r>
+              <w:rPr>
+                <w:highlight w:val="lightGray"/>
+              </w:rPr>
+              <w:t xml:space="preserve">y/x</w:t>
+            </w:r>
+          </w:p>
+        </w:tc>
+        <w:tc>
+          <w:tcPr>
+            <w:tcBorders>
+              <w:top w:val="single" w:sz="1" w:space="0" w:color="000000"/>
+              <w:bottom w:val="single" w:sz="1" w:space="0" w:color="000000"/>
+              <w:left w:val="single" w:sz="1" w:space="0" w:color="000000"/>
+              <w:right w:val="single" w:sz="1" w:space="0" w:color="000000"/>
+            </w:tcBorders>
+          </w:tcPr>
+          <w:p>
+            <w:pPr>
+              <w:spacing w:lineRule="auto"/>
+            </w:pPr>
+            <w:r>
+              <w:rPr/>
+              <w:t xml:space="preserve">Master groups joined on this account / total master</w:t>
             </w:r>
           </w:p>
         </w:tc>
@@ -6690,7 +6734,63 @@
             </w:pPr>
             <w:r>
               <w:rPr/>
-              <w:t xml:space="preserve"> — detach account from slot (confirmation modal)</w:t>
+              <w:t xml:space="preserve"> — delete account row + rebuild brand master (confirmation)</w:t>
+            </w:r>
+          </w:p>
+        </w:tc>
+      </w:tr>
+      <w:tr>
+        <w:trPr>
+          <w:cantSplit/>
+        </w:trPr>
+        <w:tc>
+          <w:tcPr>
+            <w:tcBorders>
+              <w:top w:val="single" w:sz="1" w:space="0" w:color="000000"/>
+              <w:bottom w:val="single" w:sz="1" w:space="0" w:color="000000"/>
+              <w:left w:val="single" w:sz="1" w:space="0" w:color="000000"/>
+              <w:right w:val="single" w:sz="1" w:space="0" w:color="000000"/>
+            </w:tcBorders>
+          </w:tcPr>
+          <w:p>
+            <w:pPr>
+              <w:spacing w:lineRule="auto"/>
+            </w:pPr>
+            <w:r>
+              <w:rPr>
+                <w:b/>
+              </w:rPr>
+              <w:t xml:space="preserve">X (hover, Session column, Valid only)</w:t>
+            </w:r>
+          </w:p>
+        </w:tc>
+        <w:tc>
+          <w:tcPr>
+            <w:tcBorders>
+              <w:top w:val="single" w:sz="1" w:space="0" w:color="000000"/>
+              <w:bottom w:val="single" w:sz="1" w:space="0" w:color="000000"/>
+              <w:left w:val="single" w:sz="1" w:space="0" w:color="000000"/>
+              <w:right w:val="single" w:sz="1" w:space="0" w:color="000000"/>
+            </w:tcBorders>
+          </w:tcPr>
+          <w:p>
+            <w:pPr>
+              <w:spacing w:lineRule="auto"/>
+            </w:pPr>
+            <w:r>
+              <w:rPr>
+                <w:b/>
+              </w:rPr>
+              <w:t xml:space="preserve">Clear Session</w:t>
+            </w:r>
+          </w:p>
+          <w:p>
+            <w:pPr>
+              <w:spacing w:lineRule="auto"/>
+            </w:pPr>
+            <w:r>
+              <w:rPr/>
+              <w:t xml:space="preserve"> — log out on this PC + database; next Sync opens clean QR</w:t>
             </w:r>
           </w:p>
         </w:tc>
@@ -6735,7 +6835,7 @@
             </w:pPr>
             <w:r>
               <w:rPr/>
-              <w:t xml:space="preserve">Modal: group name, ID, invite link, admin flag — needs scrape data</w:t>
+              <w:t xml:space="preserve">Modal: daily 7-column table or admin vs master — needs scrape data</w:t>
             </w:r>
           </w:p>
         </w:tc>
@@ -8428,26 +8528,71 @@
             </w:pPr>
             <w:r>
               <w:rPr/>
-              <w:t xml:space="preserve">Table</w:t>
-            </w:r>
-          </w:p>
-        </w:tc>
-        <w:tc>
-          <w:tcPr>
-            <w:tcBorders>
-              <w:top w:val="single" w:sz="1" w:space="0" w:color="000000"/>
-              <w:bottom w:val="single" w:sz="1" w:space="0" w:color="000000"/>
-              <w:left w:val="single" w:sz="1" w:space="0" w:color="000000"/>
-              <w:right w:val="single" w:sz="1" w:space="0" w:color="000000"/>
-            </w:tcBorders>
-          </w:tcPr>
-          <w:p>
-            <w:pPr>
-              <w:spacing w:lineRule="auto"/>
-            </w:pPr>
-            <w:r>
-              <w:rPr/>
-              <w:t xml:space="preserve">Group name, Group ID, Invite link, Admin (Yes/No)</w:t>
+              <w:t xml:space="preserve">Table (daily mode)</w:t>
+            </w:r>
+          </w:p>
+        </w:tc>
+        <w:tc>
+          <w:tcPr>
+            <w:tcBorders>
+              <w:top w:val="single" w:sz="1" w:space="0" w:color="000000"/>
+              <w:bottom w:val="single" w:sz="1" w:space="0" w:color="000000"/>
+              <w:left w:val="single" w:sz="1" w:space="0" w:color="000000"/>
+              <w:right w:val="single" w:sz="1" w:space="0" w:color="000000"/>
+            </w:tcBorders>
+          </w:tcPr>
+          <w:p>
+            <w:pPr>
+              <w:spacing w:lineRule="auto"/>
+            </w:pPr>
+            <w:r>
+              <w:rPr/>
+              <w:t xml:space="preserve">No, Group Name, Group ID, Member Count, Admin Count, Is Admin, Invite Link</w:t>
+            </w:r>
+          </w:p>
+        </w:tc>
+      </w:tr>
+      <w:tr>
+        <w:trPr>
+          <w:cantSplit/>
+        </w:trPr>
+        <w:tc>
+          <w:tcPr>
+            <w:tcBorders>
+              <w:top w:val="single" w:sz="1" w:space="0" w:color="000000"/>
+              <w:bottom w:val="single" w:sz="1" w:space="0" w:color="000000"/>
+              <w:left w:val="single" w:sz="1" w:space="0" w:color="000000"/>
+              <w:right w:val="single" w:sz="1" w:space="0" w:color="000000"/>
+            </w:tcBorders>
+          </w:tcPr>
+          <w:p>
+            <w:pPr>
+              <w:spacing w:lineRule="auto"/>
+            </w:pPr>
+            <w:r>
+              <w:rPr/>
+              <w:t xml:space="preserve">Excel export</w:t>
+            </w:r>
+          </w:p>
+        </w:tc>
+        <w:tc>
+          <w:tcPr>
+            <w:tcBorders>
+              <w:top w:val="single" w:sz="1" w:space="0" w:color="000000"/>
+              <w:bottom w:val="single" w:sz="1" w:space="0" w:color="000000"/>
+              <w:left w:val="single" w:sz="1" w:space="0" w:color="000000"/>
+              <w:right w:val="single" w:sz="1" w:space="0" w:color="000000"/>
+            </w:tcBorders>
+          </w:tcPr>
+          <w:p>
+            <w:pPr>
+              <w:spacing w:lineRule="auto"/>
+            </w:pPr>
+            <w:r>
+              <w:rPr>
+                <w:highlight w:val="lightGray"/>
+              </w:rPr>
+              <w:t xml:space="preserve">RM-[account name]-YYYYMMDD.xlsx</w:t>
             </w:r>
           </w:p>
         </w:tc>
@@ -9811,70 +9956,6 @@
               <w:rPr>
                 <w:b/>
               </w:rPr>
-              <w:t xml:space="preserve">Group count mismatch</w:t>
-            </w:r>
-          </w:p>
-        </w:tc>
-        <w:tc>
-          <w:tcPr>
-            <w:tcBorders>
-              <w:top w:val="single" w:sz="1" w:space="0" w:color="000000"/>
-              <w:bottom w:val="single" w:sz="1" w:space="0" w:color="000000"/>
-              <w:left w:val="single" w:sz="1" w:space="0" w:color="000000"/>
-              <w:right w:val="single" w:sz="1" w:space="0" w:color="000000"/>
-            </w:tcBorders>
-          </w:tcPr>
-          <w:p>
-            <w:pPr>
-              <w:spacing w:lineRule="auto"/>
-            </w:pPr>
-            <w:r>
-              <w:rPr/>
-              <w:t xml:space="preserve">Device count ≠ brand standard</w:t>
-            </w:r>
-          </w:p>
-        </w:tc>
-        <w:tc>
-          <w:tcPr>
-            <w:tcBorders>
-              <w:top w:val="single" w:sz="1" w:space="0" w:color="000000"/>
-              <w:bottom w:val="single" w:sz="1" w:space="0" w:color="000000"/>
-              <w:left w:val="single" w:sz="1" w:space="0" w:color="000000"/>
-              <w:right w:val="single" w:sz="1" w:space="0" w:color="000000"/>
-            </w:tcBorders>
-          </w:tcPr>
-          <w:p>
-            <w:pPr>
-              <w:spacing w:lineRule="auto"/>
-            </w:pPr>
-            <w:r>
-              <w:rPr/>
-              <w:t xml:space="preserve">Audit and align</w:t>
-            </w:r>
-          </w:p>
-        </w:tc>
-      </w:tr>
-      <w:tr>
-        <w:trPr>
-          <w:cantSplit/>
-        </w:trPr>
-        <w:tc>
-          <w:tcPr>
-            <w:tcBorders>
-              <w:top w:val="single" w:sz="1" w:space="0" w:color="000000"/>
-              <w:bottom w:val="single" w:sz="1" w:space="0" w:color="000000"/>
-              <w:left w:val="single" w:sz="1" w:space="0" w:color="000000"/>
-              <w:right w:val="single" w:sz="1" w:space="0" w:color="000000"/>
-            </w:tcBorders>
-          </w:tcPr>
-          <w:p>
-            <w:pPr>
-              <w:spacing w:lineRule="auto"/>
-            </w:pPr>
-            <w:r>
-              <w:rPr>
-                <w:b/>
-              </w:rPr>
               <w:t xml:space="preserve">Duplicate group ID</w:t>
             </w:r>
           </w:p>
@@ -15665,7 +15746,65 @@
       </w:r>
       <w:r>
         <w:rPr/>
-        <w:t xml:space="preserve">No — it only hides the card until you reload or refilter.</w:t>
+        <w:t xml:space="preserve">Yes — after confirmation it removes the brand and related data from the database.</w:t>
+      </w:r>
+    </w:p>
+    <w:p>
+      <w:pPr>
+        <w:spacing w:lineRule="auto"/>
+      </w:pPr>
+      <w:r>
+        <w:rPr>
+          <w:b/>
+        </w:rPr>
+        <w:t xml:space="preserve">Why QR error "still starting from previous attempt"?</w:t>
+      </w:r>
+      <w:r>
+        <w:rPr/>
+        <w:br w:type="textWrapping"/>
+      </w:r>
+      <w:r>
+        <w:rPr/>
+        <w:t xml:space="preserve">Stuck WA session on this PC — wait a few seconds, or use </w:t>
+      </w:r>
+      <w:r>
+        <w:rPr>
+          <w:b/>
+        </w:rPr>
+        <w:t xml:space="preserve">Clear Session</w:t>
+      </w:r>
+      <w:r>
+        <w:rPr/>
+        <w:t xml:space="preserve"> (X on Session when Valid) then Sync again.</w:t>
+      </w:r>
+    </w:p>
+    <w:p>
+      <w:pPr>
+        <w:spacing w:lineRule="auto"/>
+      </w:pPr>
+      <w:r>
+        <w:rPr>
+          <w:b/>
+        </w:rPr>
+        <w:t xml:space="preserve">Can another operator Sync an account I logged in on my PC?</w:t>
+      </w:r>
+      <w:r>
+        <w:rPr/>
+        <w:br w:type="textWrapping"/>
+      </w:r>
+      <w:r>
+        <w:rPr/>
+        <w:t xml:space="preserve">For WhatsApp, no — auth stays on your PC until they </w:t>
+      </w:r>
+      <w:r>
+        <w:rPr>
+          <w:b/>
+        </w:rPr>
+        <w:t xml:space="preserve">Clear Session</w:t>
+      </w:r>
+      <w:r>
+        <w:rPr/>
+        <w:t xml:space="preserve"> (or you do) and they scan QR on their PC.</w:t>
       </w:r>
     </w:p>
     <w:p>
@@ -15731,7 +15870,7 @@
         <w:rPr>
           <w:rFonts w:ascii="Courier" w:hAnsi="Courier"/>
         </w:rPr>
-        <w:t xml:space="preserve">Login (Username / Password)   └─ Group Monitoring         ├─ [Tab Account]         │     ├─ KPI: Brands, Accounts, Online, Aligned, Issue, Open issues         │     ├─ Slicer: Search, Brand, Platform, Status, Card|Table, Export         │     └─ Per Brand Card         │           ├─ +Add account (WhatsApp / Telegram)         │           ├─ Row: Sync ↻ | Remove X | Group link         │           └─ Scraper: Run         └─ [Tab Ticket]               ├─ KPI: Open, Missing, Not admin, Groups to handle, …               ├─ Slicer: Search, filters, In Progress | Completed, Export               ├─ 6 issue types               └─ Issue card → Process modal | Double-click Detail   └─ Admin         ├─ System status (Supabase, Platform, …)         ├─ Open configuration folder / Check for app updates (IT)         └─ Automatic account sync + Language (EN / 中文) </w:t>
+        <w:t xml:space="preserve">Login (Username / Password)   └─ Group Monitoring         ├─ [Tab Account]         │     ├─ KPI: Brands, Accounts, Online, Aligned, Issue, Open issues         │     ├─ Slicer: Search, Brand, Platform, Status, Card|Table, Export         │     └─ Per Brand Card         │           ├─ +Add account (WhatsApp / Telegram)         │           ├─ Row: Sync ↻ | Remove X (account) | Clear X (session) | Group link         │           └─ Scraper: Run         └─ [Tab Ticket]               ├─ KPI: Open, Missing, Not admin, Groups to handle, …               ├─ Slicer: Search, filters, In Progress | Completed, Export               ├─ 6 issue types               └─ Issue card → Process modal | Double-click Detail   └─ Admin         ├─ System status (Supabase, Platform, …)         ├─ Open configuration folder / Check for app updates (IT)         └─ Automatic account sync + Language (EN / 中文) </w:t>
       </w:r>
     </w:p>
     <w:p>
@@ -16040,7 +16179,7 @@
         <w:rPr>
           <w:b/>
         </w:rPr>
-        <w:t xml:space="preserve">1.0.11</w:t>
+        <w:t xml:space="preserve">1.0.14</w:t>
       </w:r>
       <w:r>
         <w:rPr/>
@@ -16053,7 +16192,7 @@
       </w:pPr>
       <w:r>
         <w:rPr/>
-        <w:t xml:space="preserve">Internal use only — Resource Management v1.0.11</w:t>
+        <w:t xml:space="preserve">Internal use only — Resource Management v1.0.14</w:t>
       </w:r>
     </w:p>
   </w:body>

</xml_diff>

<commit_message>
release: v1.0.15 — Clear Session parity Telegram, docs & handbook.
Bump version; dokumentasi WA/TG multi-PC & Clear Session; rebuild panduan EN/ZH PDF/DOCX. CI Release multi-platform akan build otomatis.

Co-authored-by: Cursor <cursoragent@cursor.com>
</commit_message>
<xml_diff>
--- a/docs/guides/documents/EN/Resource-Management-User-Guide-EN.docx
+++ b/docs/guides/documents/EN/Resource-Management-User-Guide-EN.docx
@@ -146,7 +146,7 @@
             </w:pPr>
             <w:r>
               <w:rPr/>
-              <w:t xml:space="preserve">1.0.14</w:t>
+              <w:t xml:space="preserve">1.0.15</w:t>
             </w:r>
           </w:p>
         </w:tc>
@@ -13513,7 +13513,27 @@
             </w:pPr>
             <w:r>
               <w:rPr/>
-              <w:t xml:space="preserve">WhatsApp auth per account, auto-sync preference, language</w:t>
+              <w:t xml:space="preserve">WhatsApp auth per account (</w:t>
+            </w:r>
+          </w:p>
+          <w:p>
+            <w:pPr>
+              <w:spacing w:lineRule="auto"/>
+            </w:pPr>
+            <w:r>
+              <w:rPr>
+                <w:b/>
+              </w:rPr>
+              <w:t xml:space="preserve">only on the PC that scanned QR</w:t>
+            </w:r>
+          </w:p>
+          <w:p>
+            <w:pPr>
+              <w:spacing w:lineRule="auto"/>
+            </w:pPr>
+            <w:r>
+              <w:rPr/>
+              <w:t xml:space="preserve">), auto-sync preference, language</w:t>
             </w:r>
           </w:p>
         </w:tc>
@@ -13525,6 +13545,96 @@
       </w:pPr>
       <w:r>
         <w:rPr/>
+      </w:r>
+    </w:p>
+    <w:p>
+      <w:pPr>
+        <w:spacing w:lineRule="auto"/>
+      </w:pPr>
+      <w:r>
+        <w:rPr>
+          <w:b/>
+        </w:rPr>
+        <w:t xml:space="preserve">WhatsApp multi-PC:</w:t>
+      </w:r>
+      <w:r>
+        <w:rPr/>
+        <w:t xml:space="preserve"> Session does not move between PCs. Hand off → </w:t>
+      </w:r>
+      <w:r>
+        <w:rPr>
+          <w:b/>
+        </w:rPr>
+        <w:t xml:space="preserve">Clear Session</w:t>
+      </w:r>
+      <w:r>
+        <w:rPr/>
+        <w:t xml:space="preserve"> on the old PC (optional) → new operator </w:t>
+      </w:r>
+      <w:r>
+        <w:rPr>
+          <w:b/>
+        </w:rPr>
+        <w:t xml:space="preserve">Sync</w:t>
+      </w:r>
+      <w:r>
+        <w:rPr/>
+        <w:t xml:space="preserve"> + scan QR on their PC.</w:t>
+      </w:r>
+    </w:p>
+    <w:p>
+      <w:pPr>
+        <w:spacing w:lineRule="auto"/>
+      </w:pPr>
+      <w:r>
+        <w:rPr>
+          <w:b/>
+        </w:rPr>
+        <w:t xml:space="preserve">Telegram multi-PC:</w:t>
+      </w:r>
+      <w:r>
+        <w:rPr/>
+        <w:t xml:space="preserve"> Session string is in the cloud — another PC can </w:t>
+      </w:r>
+      <w:r>
+        <w:rPr>
+          <w:b/>
+        </w:rPr>
+        <w:t xml:space="preserve">Sync</w:t>
+      </w:r>
+      <w:r>
+        <w:rPr/>
+        <w:t xml:space="preserve">/</w:t>
+      </w:r>
+      <w:r>
+        <w:rPr>
+          <w:b/>
+        </w:rPr>
+        <w:t xml:space="preserve">Run</w:t>
+      </w:r>
+      <w:r>
+        <w:rPr/>
+        <w:t xml:space="preserve"> while Session is </w:t>
+      </w:r>
+      <w:r>
+        <w:rPr>
+          <w:b/>
+        </w:rPr>
+        <w:t xml:space="preserve">Valid</w:t>
+      </w:r>
+      <w:r>
+        <w:rPr/>
+        <w:t xml:space="preserve">. Hand off → </w:t>
+      </w:r>
+      <w:r>
+        <w:rPr>
+          <w:b/>
+        </w:rPr>
+        <w:t xml:space="preserve">Clear Session</w:t>
+      </w:r>
+      <w:r>
+        <w:rPr/>
+        <w:t xml:space="preserve"> (required) so the new operator scans QR on their PC.</w:t>
       </w:r>
     </w:p>
     <w:p>
@@ -15806,6 +15916,34 @@
         <w:rPr/>
         <w:t xml:space="preserve"> (or you do) and they scan QR on their PC.</w:t>
       </w:r>
+      <w:r>
+        <w:rPr/>
+        <w:br w:type="textWrapping"/>
+      </w:r>
+      <w:r>
+        <w:rPr/>
+        <w:t xml:space="preserve">For Telegram, another PC can use the account while Session is </w:t>
+      </w:r>
+      <w:r>
+        <w:rPr>
+          <w:b/>
+        </w:rPr>
+        <w:t xml:space="preserve">Valid</w:t>
+      </w:r>
+      <w:r>
+        <w:rPr/>
+        <w:t xml:space="preserve"> (session string is in the cloud). Hand off to a new operator with </w:t>
+      </w:r>
+      <w:r>
+        <w:rPr>
+          <w:b/>
+        </w:rPr>
+        <w:t xml:space="preserve">Clear Session</w:t>
+      </w:r>
+      <w:r>
+        <w:rPr/>
+        <w:t xml:space="preserve"> so they scan QR on their PC.</w:t>
+      </w:r>
     </w:p>
     <w:p>
       <w:pPr>
@@ -16179,7 +16317,7 @@
         <w:rPr>
           <w:b/>
         </w:rPr>
-        <w:t xml:space="preserve">1.0.14</w:t>
+        <w:t xml:space="preserve">1.0.15</w:t>
       </w:r>
       <w:r>
         <w:rPr/>
@@ -16192,7 +16330,7 @@
       </w:pPr>
       <w:r>
         <w:rPr/>
-        <w:t xml:space="preserve">Internal use only — Resource Management v1.0.14</w:t>
+        <w:t xml:space="preserve">Internal use only — Resource Management v1.0.15</w:t>
       </w:r>
     </w:p>
   </w:body>

</xml_diff>

<commit_message>
release: v1.0.17 — session probe, fresh ticket/reporting, Reporting filter UX
Session resolve per grid row_id with 20s probe and device_busy handling; invalidate master/daily cache after scrape so tickets and Reporting stay fresh; matrix column filter empty state keeps headers and Back to all groups; docs and handbook rebuilt for 1.0.17.

Co-authored-by: Cursor <cursoragent@cursor.com>
</commit_message>
<xml_diff>
--- a/docs/guides/documents/EN/Resource-Management-User-Guide-EN.docx
+++ b/docs/guides/documents/EN/Resource-Management-User-Guide-EN.docx
@@ -5,7 +5,7 @@
     <w:sectPr>
       <w:pgSz w:w="12240" w:h="15840" w:orient="portrait"/>
       <w:pgMar w:top="1440" w:right="1800" w:bottom="1440" w:left="1800" w:header="720" w:footer="720" w:gutter="0"/>
-      <w:footerReference r:id="rId36" w:type="default"/>
+      <w:footerReference r:id="rId38" w:type="default"/>
     </w:sectPr>
     <w:p>
       <w:pPr>
@@ -146,7 +146,7 @@
             </w:pPr>
             <w:r>
               <w:rPr/>
-              <w:t xml:space="preserve">1.0.15</w:t>
+              <w:t xml:space="preserve">1.0.17</w:t>
             </w:r>
           </w:p>
         </w:tc>
@@ -413,7 +413,7 @@
           <w:rPr>
             <w:rStyle w:val="Hyperlink"/>
           </w:rPr>
-          <w:t xml:space="preserve">6. Admin page</w:t>
+          <w:t xml:space="preserve">6. Reporting tab — join/admin matrix</w:t>
         </w:r>
       </w:hyperlink>
     </w:p>
@@ -430,7 +430,7 @@
           <w:rPr>
             <w:rStyle w:val="Hyperlink"/>
           </w:rPr>
-          <w:t xml:space="preserve">7. Data synchronization (realtime)</w:t>
+          <w:t xml:space="preserve">7. Admin page</w:t>
         </w:r>
       </w:hyperlink>
     </w:p>
@@ -447,7 +447,7 @@
           <w:rPr>
             <w:rStyle w:val="Hyperlink"/>
           </w:rPr>
-          <w:t xml:space="preserve">8. Recommended daily workflows</w:t>
+          <w:t xml:space="preserve">8. Data synchronization (realtime)</w:t>
         </w:r>
       </w:hyperlink>
     </w:p>
@@ -464,7 +464,7 @@
           <w:rPr>
             <w:rStyle w:val="Hyperlink"/>
           </w:rPr>
-          <w:t xml:space="preserve">9. Glossary</w:t>
+          <w:t xml:space="preserve">9. Recommended daily workflows</w:t>
         </w:r>
       </w:hyperlink>
     </w:p>
@@ -481,7 +481,7 @@
           <w:rPr>
             <w:rStyle w:val="Hyperlink"/>
           </w:rPr>
-          <w:t xml:space="preserve">10. FAQ</w:t>
+          <w:t xml:space="preserve">10. Glossary</w:t>
         </w:r>
       </w:hyperlink>
     </w:p>
@@ -494,6 +494,23 @@
         <w:spacing w:lineRule="auto"/>
       </w:pPr>
       <w:hyperlink r:id="rId17">
+        <w:r>
+          <w:rPr>
+            <w:rStyle w:val="Hyperlink"/>
+          </w:rPr>
+          <w:t xml:space="preserve">11. FAQ</w:t>
+        </w:r>
+      </w:hyperlink>
+    </w:p>
+    <w:p>
+      <w:pPr>
+        <w:numPr>
+          <w:ilvl w:val="0"/>
+          <w:numId w:val="1"/>
+        </w:numPr>
+        <w:spacing w:lineRule="auto"/>
+      </w:pPr>
+      <w:hyperlink r:id="rId18">
         <w:r>
           <w:rPr>
             <w:rStyle w:val="Hyperlink"/>
@@ -520,7 +537,7 @@
         <w:rPr/>
         <w:t xml:space="preserve"> in the current application. For architecture and IT release notes, see </w:t>
       </w:r>
-      <w:hyperlink r:id="rId18">
+      <w:hyperlink r:id="rId19">
         <w:r>
           <w:rPr>
             <w:rStyle w:val="Hyperlink"/>
@@ -551,7 +568,7 @@
         </w:numPr>
         <w:spacing w:lineRule="auto"/>
       </w:pPr>
-      <w:hyperlink r:id="rId19">
+      <w:hyperlink r:id="rId20">
         <w:r>
           <w:rPr>
             <w:rStyle w:val="Hyperlink"/>
@@ -568,7 +585,7 @@
         </w:numPr>
         <w:spacing w:lineRule="auto"/>
       </w:pPr>
-      <w:hyperlink r:id="rId20">
+      <w:hyperlink r:id="rId21">
         <w:r>
           <w:rPr>
             <w:rStyle w:val="Hyperlink"/>
@@ -585,7 +602,7 @@
         </w:numPr>
         <w:spacing w:lineRule="auto"/>
       </w:pPr>
-      <w:hyperlink r:id="rId21">
+      <w:hyperlink r:id="rId22">
         <w:r>
           <w:rPr>
             <w:rStyle w:val="Hyperlink"/>
@@ -602,7 +619,7 @@
         </w:numPr>
         <w:spacing w:lineRule="auto"/>
       </w:pPr>
-      <w:hyperlink r:id="rId22">
+      <w:hyperlink r:id="rId23">
         <w:r>
           <w:rPr>
             <w:rStyle w:val="Hyperlink"/>
@@ -619,7 +636,7 @@
         </w:numPr>
         <w:spacing w:lineRule="auto"/>
       </w:pPr>
-      <w:hyperlink r:id="rId23">
+      <w:hyperlink r:id="rId24">
         <w:r>
           <w:rPr>
             <w:rStyle w:val="Hyperlink"/>
@@ -636,7 +653,24 @@
         </w:numPr>
         <w:spacing w:lineRule="auto"/>
       </w:pPr>
-      <w:hyperlink r:id="rId24">
+      <w:hyperlink r:id="rId25">
+        <w:r>
+          <w:rPr>
+            <w:rStyle w:val="Hyperlink"/>
+          </w:rPr>
+          <w:t xml:space="preserve">Reporting tab — join/admin matrix</w:t>
+        </w:r>
+      </w:hyperlink>
+    </w:p>
+    <w:p>
+      <w:pPr>
+        <w:numPr>
+          <w:ilvl w:val="0"/>
+          <w:numId w:val="2"/>
+        </w:numPr>
+        <w:spacing w:lineRule="auto"/>
+      </w:pPr>
+      <w:hyperlink r:id="rId26">
         <w:r>
           <w:rPr>
             <w:rStyle w:val="Hyperlink"/>
@@ -653,7 +687,7 @@
         </w:numPr>
         <w:spacing w:lineRule="auto"/>
       </w:pPr>
-      <w:hyperlink r:id="rId25">
+      <w:hyperlink r:id="rId27">
         <w:r>
           <w:rPr>
             <w:rStyle w:val="Hyperlink"/>
@@ -670,7 +704,7 @@
         </w:numPr>
         <w:spacing w:lineRule="auto"/>
       </w:pPr>
-      <w:hyperlink r:id="rId26">
+      <w:hyperlink r:id="rId28">
         <w:r>
           <w:rPr>
             <w:rStyle w:val="Hyperlink"/>
@@ -687,7 +721,7 @@
         </w:numPr>
         <w:spacing w:lineRule="auto"/>
       </w:pPr>
-      <w:hyperlink r:id="rId27">
+      <w:hyperlink r:id="rId29">
         <w:r>
           <w:rPr>
             <w:rStyle w:val="Hyperlink"/>
@@ -704,7 +738,7 @@
         </w:numPr>
         <w:spacing w:lineRule="auto"/>
       </w:pPr>
-      <w:hyperlink r:id="rId28">
+      <w:hyperlink r:id="rId30">
         <w:r>
           <w:rPr>
             <w:rStyle w:val="Hyperlink"/>
@@ -721,7 +755,7 @@
         </w:numPr>
         <w:spacing w:lineRule="auto"/>
       </w:pPr>
-      <w:hyperlink r:id="rId29">
+      <w:hyperlink r:id="rId31">
         <w:r>
           <w:rPr>
             <w:rStyle w:val="Hyperlink"/>
@@ -1961,7 +1995,7 @@
         <w:rPr/>
         <w:t xml:space="preserve">For detailed Windows steps, see </w:t>
       </w:r>
-      <w:hyperlink r:id="rId30">
+      <w:hyperlink r:id="rId32">
         <w:r>
           <w:rPr>
             <w:rStyle w:val="Hyperlink"/>
@@ -11835,7 +11869,7 @@
       </w:r>
       <w:r>
         <w:rPr/>
-        <w:t xml:space="preserve"> scraper to push latest device data.</w:t>
+        <w:t xml:space="preserve"> scraper to push latest device data. After scrape, ticket counts and Groups columns refresh from the latest database (not stale cache).</w:t>
       </w:r>
     </w:p>
     <w:p>
@@ -11845,7 +11879,383 @@
       </w:pPr>
       <w:r>
         <w:rPr/>
-        <w:t xml:space="preserve">6. Admin page</w:t>
+        <w:t xml:space="preserve">6. Reporting tab — join/admin matrix</w:t>
+      </w:r>
+    </w:p>
+    <w:p>
+      <w:pPr>
+        <w:spacing w:lineRule="auto"/>
+      </w:pPr>
+      <w:r>
+        <w:rPr/>
+        <w:t xml:space="preserve">Read-only — does not change sessions, scraper, or tickets.</w:t>
+      </w:r>
+    </w:p>
+    <w:tbl>
+      <w:tblPr>
+        <w:tblBorders>
+          <w:top w:val="single" w:sz="2" w:space="0" w:color="000000"/>
+          <w:bottom w:val="single" w:sz="2" w:space="0" w:color="000000"/>
+          <w:left w:val="single" w:sz="2" w:space="0" w:color="000000"/>
+          <w:right w:val="single" w:sz="2" w:space="0" w:color="000000"/>
+        </w:tblBorders>
+        <w:tblCellSpacing w:w="0" w:type="dxa"/>
+        <w:tblCellMar>
+          <w:top w:type="dxa" w:w="80"/>
+          <w:bottom w:type="dxa" w:w="80"/>
+          <w:left w:type="dxa" w:w="160"/>
+          <w:right w:type="dxa" w:w="160"/>
+        </w:tblCellMar>
+        <w:jc w:val="center"/>
+      </w:tblPr>
+      <w:tblGrid>
+        <w:gridCol w:w="4320"/>
+        <w:gridCol w:w="4320"/>
+      </w:tblGrid>
+      <w:tr>
+        <w:trPr>
+          <w:cantSplit/>
+        </w:trPr>
+        <w:tc>
+          <w:tcPr>
+            <w:tcBorders>
+              <w:top w:val="single" w:sz="1" w:space="0" w:color="000000"/>
+              <w:bottom w:val="single" w:sz="1" w:space="0" w:color="000000"/>
+              <w:left w:val="single" w:sz="1" w:space="0" w:color="000000"/>
+              <w:right w:val="single" w:sz="1" w:space="0" w:color="000000"/>
+            </w:tcBorders>
+          </w:tcPr>
+          <w:p>
+            <w:pPr>
+              <w:spacing w:lineRule="auto"/>
+            </w:pPr>
+            <w:r>
+              <w:rPr/>
+              <w:t xml:space="preserve">Filter</w:t>
+            </w:r>
+          </w:p>
+        </w:tc>
+        <w:tc>
+          <w:tcPr>
+            <w:tcBorders>
+              <w:top w:val="single" w:sz="1" w:space="0" w:color="000000"/>
+              <w:bottom w:val="single" w:sz="1" w:space="0" w:color="000000"/>
+              <w:left w:val="single" w:sz="1" w:space="0" w:color="000000"/>
+              <w:right w:val="single" w:sz="1" w:space="0" w:color="000000"/>
+            </w:tcBorders>
+          </w:tcPr>
+          <w:p>
+            <w:pPr>
+              <w:spacing w:lineRule="auto"/>
+            </w:pPr>
+            <w:r>
+              <w:rPr/>
+              <w:t xml:space="preserve">Purpose</w:t>
+            </w:r>
+          </w:p>
+        </w:tc>
+      </w:tr>
+      <w:tblGrid>
+        <w:gridCol w:w="4320"/>
+        <w:gridCol w:w="4320"/>
+      </w:tblGrid>
+      <w:tr>
+        <w:trPr>
+          <w:cantSplit/>
+        </w:trPr>
+        <w:tc>
+          <w:tcPr>
+            <w:tcBorders>
+              <w:top w:val="single" w:sz="1" w:space="0" w:color="000000"/>
+              <w:bottom w:val="single" w:sz="1" w:space="0" w:color="000000"/>
+              <w:left w:val="single" w:sz="1" w:space="0" w:color="000000"/>
+              <w:right w:val="single" w:sz="1" w:space="0" w:color="000000"/>
+            </w:tcBorders>
+          </w:tcPr>
+          <w:p>
+            <w:pPr>
+              <w:spacing w:lineRule="auto"/>
+            </w:pPr>
+            <w:r>
+              <w:rPr>
+                <w:b/>
+              </w:rPr>
+              <w:t xml:space="preserve">Platform</w:t>
+            </w:r>
+          </w:p>
+        </w:tc>
+        <w:tc>
+          <w:tcPr>
+            <w:tcBorders>
+              <w:top w:val="single" w:sz="1" w:space="0" w:color="000000"/>
+              <w:bottom w:val="single" w:sz="1" w:space="0" w:color="000000"/>
+              <w:left w:val="single" w:sz="1" w:space="0" w:color="000000"/>
+              <w:right w:val="single" w:sz="1" w:space="0" w:color="000000"/>
+            </w:tcBorders>
+          </w:tcPr>
+          <w:p>
+            <w:pPr>
+              <w:spacing w:lineRule="auto"/>
+            </w:pPr>
+            <w:r>
+              <w:rPr/>
+              <w:t xml:space="preserve">WhatsApp or Telegram</w:t>
+            </w:r>
+          </w:p>
+        </w:tc>
+      </w:tr>
+      <w:tr>
+        <w:trPr>
+          <w:cantSplit/>
+        </w:trPr>
+        <w:tc>
+          <w:tcPr>
+            <w:tcBorders>
+              <w:top w:val="single" w:sz="1" w:space="0" w:color="000000"/>
+              <w:bottom w:val="single" w:sz="1" w:space="0" w:color="000000"/>
+              <w:left w:val="single" w:sz="1" w:space="0" w:color="000000"/>
+              <w:right w:val="single" w:sz="1" w:space="0" w:color="000000"/>
+            </w:tcBorders>
+          </w:tcPr>
+          <w:p>
+            <w:pPr>
+              <w:spacing w:lineRule="auto"/>
+            </w:pPr>
+            <w:r>
+              <w:rPr>
+                <w:b/>
+              </w:rPr>
+              <w:t xml:space="preserve">Brand</w:t>
+            </w:r>
+          </w:p>
+        </w:tc>
+        <w:tc>
+          <w:tcPr>
+            <w:tcBorders>
+              <w:top w:val="single" w:sz="1" w:space="0" w:color="000000"/>
+              <w:bottom w:val="single" w:sz="1" w:space="0" w:color="000000"/>
+              <w:left w:val="single" w:sz="1" w:space="0" w:color="000000"/>
+              <w:right w:val="single" w:sz="1" w:space="0" w:color="000000"/>
+            </w:tcBorders>
+          </w:tcPr>
+          <w:p>
+            <w:pPr>
+              <w:spacing w:lineRule="auto"/>
+            </w:pPr>
+            <w:r>
+              <w:rPr/>
+              <w:t xml:space="preserve">Brand with accounts</w:t>
+            </w:r>
+          </w:p>
+        </w:tc>
+      </w:tr>
+      <w:tr>
+        <w:trPr>
+          <w:cantSplit/>
+        </w:trPr>
+        <w:tc>
+          <w:tcPr>
+            <w:tcBorders>
+              <w:top w:val="single" w:sz="1" w:space="0" w:color="000000"/>
+              <w:bottom w:val="single" w:sz="1" w:space="0" w:color="000000"/>
+              <w:left w:val="single" w:sz="1" w:space="0" w:color="000000"/>
+              <w:right w:val="single" w:sz="1" w:space="0" w:color="000000"/>
+            </w:tcBorders>
+          </w:tcPr>
+          <w:p>
+            <w:pPr>
+              <w:spacing w:lineRule="auto"/>
+            </w:pPr>
+            <w:r>
+              <w:rPr>
+                <w:b/>
+              </w:rPr>
+              <w:t xml:space="preserve">Acc Name</w:t>
+            </w:r>
+          </w:p>
+        </w:tc>
+        <w:tc>
+          <w:tcPr>
+            <w:tcBorders>
+              <w:top w:val="single" w:sz="1" w:space="0" w:color="000000"/>
+              <w:bottom w:val="single" w:sz="1" w:space="0" w:color="000000"/>
+              <w:left w:val="single" w:sz="1" w:space="0" w:color="000000"/>
+              <w:right w:val="single" w:sz="1" w:space="0" w:color="000000"/>
+            </w:tcBorders>
+          </w:tcPr>
+          <w:p>
+            <w:pPr>
+              <w:spacing w:lineRule="auto"/>
+            </w:pPr>
+            <w:r>
+              <w:rPr>
+                <w:b/>
+              </w:rPr>
+              <w:t xml:space="preserve">All</w:t>
+            </w:r>
+          </w:p>
+          <w:p>
+            <w:pPr>
+              <w:spacing w:lineRule="auto"/>
+            </w:pPr>
+            <w:r>
+              <w:rPr/>
+              <w:t xml:space="preserve"> = matrix for all accounts; one account = single-account report</w:t>
+            </w:r>
+          </w:p>
+        </w:tc>
+      </w:tr>
+      <w:tr>
+        <w:trPr>
+          <w:cantSplit/>
+        </w:trPr>
+        <w:tc>
+          <w:tcPr>
+            <w:tcBorders>
+              <w:top w:val="single" w:sz="1" w:space="0" w:color="000000"/>
+              <w:bottom w:val="single" w:sz="1" w:space="0" w:color="000000"/>
+              <w:left w:val="single" w:sz="1" w:space="0" w:color="000000"/>
+              <w:right w:val="single" w:sz="1" w:space="0" w:color="000000"/>
+            </w:tcBorders>
+          </w:tcPr>
+          <w:p>
+            <w:pPr>
+              <w:spacing w:lineRule="auto"/>
+            </w:pPr>
+            <w:r>
+              <w:rPr>
+                <w:b/>
+              </w:rPr>
+              <w:t xml:space="preserve">Full Group / Full Admin</w:t>
+            </w:r>
+          </w:p>
+        </w:tc>
+        <w:tc>
+          <w:tcPr>
+            <w:tcBorders>
+              <w:top w:val="single" w:sz="1" w:space="0" w:color="000000"/>
+              <w:bottom w:val="single" w:sz="1" w:space="0" w:color="000000"/>
+              <w:left w:val="single" w:sz="1" w:space="0" w:color="000000"/>
+              <w:right w:val="single" w:sz="1" w:space="0" w:color="000000"/>
+            </w:tcBorders>
+          </w:tcPr>
+          <w:p>
+            <w:pPr>
+              <w:spacing w:lineRule="auto"/>
+            </w:pPr>
+            <w:r>
+              <w:rPr/>
+              <w:t xml:space="preserve">Join status or admin status vs master</w:t>
+            </w:r>
+          </w:p>
+        </w:tc>
+      </w:tr>
+      <w:tr>
+        <w:trPr>
+          <w:cantSplit/>
+        </w:trPr>
+        <w:tc>
+          <w:tcPr>
+            <w:tcBorders>
+              <w:top w:val="single" w:sz="1" w:space="0" w:color="000000"/>
+              <w:bottom w:val="single" w:sz="1" w:space="0" w:color="000000"/>
+              <w:left w:val="single" w:sz="1" w:space="0" w:color="000000"/>
+              <w:right w:val="single" w:sz="1" w:space="0" w:color="000000"/>
+            </w:tcBorders>
+          </w:tcPr>
+          <w:p>
+            <w:pPr>
+              <w:spacing w:lineRule="auto"/>
+            </w:pPr>
+            <w:r>
+              <w:rPr>
+                <w:b/>
+              </w:rPr>
+              <w:t xml:space="preserve">Search group name</w:t>
+            </w:r>
+          </w:p>
+        </w:tc>
+        <w:tc>
+          <w:tcPr>
+            <w:tcBorders>
+              <w:top w:val="single" w:sz="1" w:space="0" w:color="000000"/>
+              <w:bottom w:val="single" w:sz="1" w:space="0" w:color="000000"/>
+              <w:left w:val="single" w:sz="1" w:space="0" w:color="000000"/>
+              <w:right w:val="single" w:sz="1" w:space="0" w:color="000000"/>
+            </w:tcBorders>
+          </w:tcPr>
+          <w:p>
+            <w:pPr>
+              <w:spacing w:lineRule="auto"/>
+            </w:pPr>
+            <w:r>
+              <w:rPr/>
+              <w:t xml:space="preserve">Filter by group name</w:t>
+            </w:r>
+          </w:p>
+        </w:tc>
+      </w:tr>
+    </w:tbl>
+    <w:p>
+      <w:pPr>
+        <w:spacing w:lineRule="auto"/>
+      </w:pPr>
+      <w:r>
+        <w:rPr/>
+      </w:r>
+    </w:p>
+    <w:p>
+      <w:pPr>
+        <w:spacing w:lineRule="auto"/>
+      </w:pPr>
+      <w:r>
+        <w:rPr>
+          <w:b/>
+        </w:rPr>
+        <w:t xml:space="preserve">Matrix (Acc Name = All):</w:t>
+      </w:r>
+      <w:r>
+        <w:rPr/>
+        <w:t xml:space="preserve"> master rows × account columns (Yes/No). Column header dropdown: Yes / No / All. If filter returns no rows, table headers stay visible — click </w:t>
+      </w:r>
+      <w:r>
+        <w:rPr>
+          <w:b/>
+        </w:rPr>
+        <w:t xml:space="preserve">Back to all groups</w:t>
+      </w:r>
+      <w:r>
+        <w:rPr/>
+        <w:t xml:space="preserve"> or choose </w:t>
+      </w:r>
+      <w:r>
+        <w:rPr>
+          <w:b/>
+        </w:rPr>
+        <w:t xml:space="preserve">All</w:t>
+      </w:r>
+      <w:r>
+        <w:rPr/>
+        <w:t xml:space="preserve">.</w:t>
+      </w:r>
+    </w:p>
+    <w:p>
+      <w:pPr>
+        <w:spacing w:lineRule="auto"/>
+      </w:pPr>
+      <w:r>
+        <w:rPr/>
+        <w:t xml:space="preserve">Updates automatically after scrape or Supabase changes (realtime).</w:t>
+      </w:r>
+    </w:p>
+    <w:p>
+      <w:pPr>
+        <w:pStyle w:val="Heading2"/>
+        <w:spacing w:lineRule="auto"/>
+      </w:pPr>
+      <w:r>
+        <w:rPr/>
+        <w:t xml:space="preserve">7. Admin page</w:t>
       </w:r>
     </w:p>
     <w:p>
@@ -12912,7 +13322,7 @@
       </w:pPr>
       <w:r>
         <w:rPr/>
-        <w:t xml:space="preserve">7. Data synchronization (realtime)</w:t>
+        <w:t xml:space="preserve">8. Data synchronization (realtime)</w:t>
       </w:r>
     </w:p>
     <w:p>
@@ -13154,7 +13564,7 @@
         <w:rPr/>
         <w:t xml:space="preserve">). See </w:t>
       </w:r>
-      <w:hyperlink r:id="rId31">
+      <w:hyperlink r:id="rId33">
         <w:r>
           <w:rPr>
             <w:rStyle w:val="Hyperlink"/>
@@ -13644,7 +14054,7 @@
       </w:pPr>
       <w:r>
         <w:rPr/>
-        <w:t xml:space="preserve">8. Recommended daily workflows</w:t>
+        <w:t xml:space="preserve">9. Recommended daily workflows</w:t>
       </w:r>
     </w:p>
     <w:p>
@@ -14906,7 +15316,7 @@
       </w:pPr>
       <w:r>
         <w:rPr/>
-        <w:t xml:space="preserve">9. Glossary</w:t>
+        <w:t xml:space="preserve">10. Glossary</w:t>
       </w:r>
     </w:p>
     <w:tbl>
@@ -15598,7 +16008,7 @@
       </w:pPr>
       <w:r>
         <w:rPr/>
-        <w:t xml:space="preserve">10. FAQ</w:t>
+        <w:t xml:space="preserve">11. FAQ</w:t>
       </w:r>
     </w:p>
     <w:p>
@@ -16125,7 +16535,7 @@
             <w:pPr>
               <w:spacing w:lineRule="auto"/>
             </w:pPr>
-            <w:hyperlink r:id="rId32">
+            <w:hyperlink r:id="rId34">
               <w:r>
                 <w:rPr>
                   <w:rStyle w:val="Hyperlink"/>
@@ -16172,7 +16582,7 @@
             <w:pPr>
               <w:spacing w:lineRule="auto"/>
             </w:pPr>
-            <w:hyperlink r:id="rId33">
+            <w:hyperlink r:id="rId35">
               <w:r>
                 <w:rPr>
                   <w:rStyle w:val="Hyperlink"/>
@@ -16219,7 +16629,7 @@
             <w:pPr>
               <w:spacing w:lineRule="auto"/>
             </w:pPr>
-            <w:hyperlink r:id="rId34">
+            <w:hyperlink r:id="rId36">
               <w:r>
                 <w:rPr>
                   <w:rStyle w:val="Hyperlink"/>
@@ -16266,7 +16676,7 @@
             <w:pPr>
               <w:spacing w:lineRule="auto"/>
             </w:pPr>
-            <w:hyperlink r:id="rId35">
+            <w:hyperlink r:id="rId37">
               <w:r>
                 <w:rPr>
                   <w:rStyle w:val="Hyperlink"/>
@@ -16317,7 +16727,7 @@
         <w:rPr>
           <w:b/>
         </w:rPr>
-        <w:t xml:space="preserve">1.0.15</w:t>
+        <w:t xml:space="preserve">1.0.17</w:t>
       </w:r>
       <w:r>
         <w:rPr/>
@@ -16330,7 +16740,7 @@
       </w:pPr>
       <w:r>
         <w:rPr/>
-        <w:t xml:space="preserve">Internal use only — Resource Management v1.0.15</w:t>
+        <w:t xml:space="preserve">Internal use only — Resource Management v1.0.17</w:t>
       </w:r>
     </w:p>
   </w:body>

</xml_diff>

<commit_message>
Release v1.0.29: Last update grid, audit fixes, and operator guide.
Remove Run button from account grid; scrape via Sync Scrape now; Job Queue enqueue+try-run; consolidate realtime reload; add panduan operasional and Confluence HTML.

Co-authored-by: Cursor <cursoragent@cursor.com>
</commit_message>
<xml_diff>
--- a/docs/guides/documents/EN/Resource-Management-User-Guide-EN.docx
+++ b/docs/guides/documents/EN/Resource-Management-User-Guide-EN.docx
@@ -146,7 +146,7 @@
             </w:pPr>
             <w:r>
               <w:rPr/>
-              <w:t xml:space="preserve">1.0.17</w:t>
+              <w:t xml:space="preserve">1.0.28</w:t>
             </w:r>
           </w:p>
         </w:tc>
@@ -548,6 +548,73 @@
       <w:r>
         <w:rPr/>
         <w:t xml:space="preserve">.</w:t>
+      </w:r>
+    </w:p>
+    <w:p>
+      <w:pPr>
+        <w:ind w:left="284"/>
+        <w:jc w:val="both"/>
+        <w:spacing w:lineRule="auto"/>
+      </w:pPr>
+      <w:r>
+        <w:rPr>
+          <w:b/>
+        </w:rPr>
+        <w:t xml:space="preserve">v1.0.24+:</w:t>
+      </w:r>
+      <w:r>
+        <w:rPr/>
+        <w:t xml:space="preserve"> The </w:t>
+      </w:r>
+      <w:r>
+        <w:rPr>
+          <w:b/>
+        </w:rPr>
+        <w:t xml:space="preserve">Ticket</w:t>
+      </w:r>
+      <w:r>
+        <w:rPr/>
+        <w:t xml:space="preserve"> tab was removed — issues appear as </w:t>
+      </w:r>
+      <w:r>
+        <w:rPr>
+          <w:b/>
+        </w:rPr>
+        <w:t xml:space="preserve">KPI cards</w:t>
+      </w:r>
+      <w:r>
+        <w:rPr/>
+        <w:t xml:space="preserve"> on the Account tab. </w:t>
+      </w:r>
+      <w:r>
+        <w:rPr>
+          <w:b/>
+        </w:rPr>
+        <w:t xml:space="preserve">Operations</w:t>
+      </w:r>
+      <w:r>
+        <w:rPr/>
+        <w:t xml:space="preserve"> tab has </w:t>
+      </w:r>
+      <w:r>
+        <w:rPr>
+          <w:b/>
+        </w:rPr>
+        <w:t xml:space="preserve">Overview</w:t>
+      </w:r>
+      <w:r>
+        <w:rPr/>
+        <w:t xml:space="preserve"> (stock) and </w:t>
+      </w:r>
+      <w:r>
+        <w:rPr>
+          <w:b/>
+        </w:rPr>
+        <w:t xml:space="preserve">Job Queue</w:t>
+      </w:r>
+      <w:r>
+        <w:rPr/>
+        <w:t xml:space="preserve"> (automation). Section 5 below is historical reference.</w:t>
       </w:r>
     </w:p>
     <w:p>
@@ -7241,7 +7308,7 @@
               <w:rPr>
                 <w:b/>
               </w:rPr>
-              <w:t xml:space="preserve">Run scraper</w:t>
+              <w:t xml:space="preserve">Scrape now</w:t>
             </w:r>
           </w:p>
           <w:p>
@@ -7662,7 +7729,7 @@
       </w:pPr>
       <w:r>
         <w:rPr/>
-        <w:t xml:space="preserve">4.6 Scraper column — **Run** button</w:t>
+        <w:t xml:space="preserve">4.6 Last update column (full scrape via Sync)</w:t>
       </w:r>
     </w:p>
     <w:tbl>
@@ -7835,7 +7902,7 @@
             </w:pPr>
             <w:r>
               <w:rPr/>
-              <w:t xml:space="preserve">Already aligned</w:t>
+              <w:t xml:space="preserve">Standby</w:t>
             </w:r>
           </w:p>
         </w:tc>
@@ -7865,121 +7932,46 @@
             </w:pPr>
             <w:r>
               <w:rPr/>
-              <w:t xml:space="preserve"> time only</w:t>
-            </w:r>
-          </w:p>
-        </w:tc>
-        <w:tc>
-          <w:tcPr>
-            <w:tcBorders>
-              <w:top w:val="single" w:sz="1" w:space="0" w:color="000000"/>
-              <w:bottom w:val="single" w:sz="1" w:space="0" w:color="000000"/>
-              <w:left w:val="single" w:sz="1" w:space="0" w:color="000000"/>
-              <w:right w:val="single" w:sz="1" w:space="0" w:color="000000"/>
-            </w:tcBorders>
-          </w:tcPr>
-          <w:p>
-            <w:pPr>
-              <w:spacing w:lineRule="auto"/>
-            </w:pPr>
-            <w:r>
-              <w:rPr/>
-              <w:t xml:space="preserve">Run usually not needed</w:t>
-            </w:r>
-          </w:p>
-        </w:tc>
-      </w:tr>
-      <w:tr>
-        <w:trPr>
-          <w:cantSplit/>
-        </w:trPr>
-        <w:tc>
-          <w:tcPr>
-            <w:tcBorders>
-              <w:top w:val="single" w:sz="1" w:space="0" w:color="000000"/>
-              <w:bottom w:val="single" w:sz="1" w:space="0" w:color="000000"/>
-              <w:left w:val="single" w:sz="1" w:space="0" w:color="000000"/>
-              <w:right w:val="single" w:sz="1" w:space="0" w:color="000000"/>
-            </w:tcBorders>
-          </w:tcPr>
-          <w:p>
-            <w:pPr>
-              <w:spacing w:lineRule="auto"/>
-            </w:pPr>
-            <w:r>
-              <w:rPr>
-                <w:b/>
-              </w:rPr>
-              <w:t xml:space="preserve">Not aligned</w:t>
-            </w:r>
-          </w:p>
-        </w:tc>
-        <w:tc>
-          <w:tcPr>
-            <w:tcBorders>
-              <w:top w:val="single" w:sz="1" w:space="0" w:color="000000"/>
-              <w:bottom w:val="single" w:sz="1" w:space="0" w:color="000000"/>
-              <w:left w:val="single" w:sz="1" w:space="0" w:color="000000"/>
-              <w:right w:val="single" w:sz="1" w:space="0" w:color="000000"/>
-            </w:tcBorders>
-          </w:tcPr>
-          <w:p>
-            <w:pPr>
-              <w:spacing w:lineRule="auto"/>
-            </w:pPr>
-            <w:r>
-              <w:rPr>
-                <w:b/>
-              </w:rPr>
-              <w:t xml:space="preserve">Run</w:t>
-            </w:r>
-          </w:p>
-          <w:p>
-            <w:pPr>
-              <w:spacing w:lineRule="auto"/>
-            </w:pPr>
-            <w:r>
-              <w:rPr/>
-              <w:t xml:space="preserve"> + timestamp</w:t>
-            </w:r>
-          </w:p>
-        </w:tc>
-        <w:tc>
-          <w:tcPr>
-            <w:tcBorders>
-              <w:top w:val="single" w:sz="1" w:space="0" w:color="000000"/>
-              <w:bottom w:val="single" w:sz="1" w:space="0" w:color="000000"/>
-              <w:left w:val="single" w:sz="1" w:space="0" w:color="000000"/>
-              <w:right w:val="single" w:sz="1" w:space="0" w:color="000000"/>
-            </w:tcBorders>
-          </w:tcPr>
-          <w:p>
-            <w:pPr>
-              <w:spacing w:lineRule="auto"/>
-            </w:pPr>
-            <w:r>
-              <w:rPr/>
-              <w:t xml:space="preserve">Click </w:t>
-            </w:r>
-          </w:p>
-          <w:p>
-            <w:pPr>
-              <w:spacing w:lineRule="auto"/>
-            </w:pPr>
-            <w:r>
-              <w:rPr>
-                <w:b/>
-              </w:rPr>
-              <w:t xml:space="preserve">Run</w:t>
-            </w:r>
-          </w:p>
-          <w:p>
-            <w:pPr>
-              <w:spacing w:lineRule="auto"/>
-            </w:pPr>
-            <w:r>
-              <w:rPr/>
-              <w:t xml:space="preserve"> → read all groups from phone → save DB → tickets refresh</w:t>
+              <w:t xml:space="preserve"> timestamp</w:t>
+            </w:r>
+          </w:p>
+        </w:tc>
+        <w:tc>
+          <w:tcPr>
+            <w:tcBorders>
+              <w:top w:val="single" w:sz="1" w:space="0" w:color="000000"/>
+              <w:bottom w:val="single" w:sz="1" w:space="0" w:color="000000"/>
+              <w:left w:val="single" w:sz="1" w:space="0" w:color="000000"/>
+              <w:right w:val="single" w:sz="1" w:space="0" w:color="000000"/>
+            </w:tcBorders>
+          </w:tcPr>
+          <w:p>
+            <w:pPr>
+              <w:spacing w:lineRule="auto"/>
+            </w:pPr>
+            <w:r>
+              <w:rPr/>
+              <w:t xml:space="preserve">Full scrape via </w:t>
+            </w:r>
+          </w:p>
+          <w:p>
+            <w:pPr>
+              <w:spacing w:lineRule="auto"/>
+            </w:pPr>
+            <w:r>
+              <w:rPr>
+                <w:b/>
+              </w:rPr>
+              <w:t xml:space="preserve">Sync → Scrape now</w:t>
+            </w:r>
+          </w:p>
+          <w:p>
+            <w:pPr>
+              <w:spacing w:lineRule="auto"/>
+            </w:pPr>
+            <w:r>
+              <w:rPr/>
+              <w:t xml:space="preserve"> when needed</w:t>
             </w:r>
           </w:p>
         </w:tc>
@@ -8031,7 +8023,18 @@
             </w:pPr>
             <w:r>
               <w:rPr/>
-              <w:t xml:space="preserve"> / progress</w:t>
+              <w:t xml:space="preserve"> / progress + </w:t>
+            </w:r>
+          </w:p>
+          <w:p>
+            <w:pPr>
+              <w:spacing w:lineRule="auto"/>
+            </w:pPr>
+            <w:r>
+              <w:rPr>
+                <w:b/>
+              </w:rPr>
+              <w:t xml:space="preserve">Cancel scrape</w:t>
             </w:r>
           </w:p>
         </w:tc>
@@ -8153,26 +8156,26 @@
               <w:rPr>
                 <w:b/>
               </w:rPr>
-              <w:t xml:space="preserve">Run</w:t>
-            </w:r>
-          </w:p>
-        </w:tc>
-        <w:tc>
-          <w:tcPr>
-            <w:tcBorders>
-              <w:top w:val="single" w:sz="1" w:space="0" w:color="000000"/>
-              <w:bottom w:val="single" w:sz="1" w:space="0" w:color="000000"/>
-              <w:left w:val="single" w:sz="1" w:space="0" w:color="000000"/>
-              <w:right w:val="single" w:sz="1" w:space="0" w:color="000000"/>
-            </w:tcBorders>
-          </w:tcPr>
-          <w:p>
-            <w:pPr>
-              <w:spacing w:lineRule="auto"/>
-            </w:pPr>
-            <w:r>
-              <w:rPr/>
-              <w:t xml:space="preserve">Full scrape — all groups written to database</w:t>
+              <w:t xml:space="preserve">Scrape now</w:t>
+            </w:r>
+          </w:p>
+        </w:tc>
+        <w:tc>
+          <w:tcPr>
+            <w:tcBorders>
+              <w:top w:val="single" w:sz="1" w:space="0" w:color="000000"/>
+              <w:bottom w:val="single" w:sz="1" w:space="0" w:color="000000"/>
+              <w:left w:val="single" w:sz="1" w:space="0" w:color="000000"/>
+              <w:right w:val="single" w:sz="1" w:space="0" w:color="000000"/>
+            </w:tcBorders>
+          </w:tcPr>
+          <w:p>
+            <w:pPr>
+              <w:spacing w:lineRule="auto"/>
+            </w:pPr>
+            <w:r>
+              <w:rPr/>
+              <w:t xml:space="preserve">Full scrape — all groups written to database (modal after Sync)</w:t>
             </w:r>
           </w:p>
         </w:tc>
@@ -8237,21 +8240,40 @@
       </w:pPr>
       <w:r>
         <w:rPr/>
-        <w:t xml:space="preserve">After login, you may see: </w:t>
-      </w:r>
-      <w:r>
-        <w:rPr/>
-        <w:t xml:space="preserve">Login OK. Device group &amp; admin counts are updated. Save the full group list to the database now?</w:t>
-      </w:r>
-      <w:r>
-        <w:rPr/>
-        <w:t xml:space="preserve"> → choose </w:t>
+        <w:t xml:space="preserve">There is </w:t>
       </w:r>
       <w:r>
         <w:rPr>
           <w:b/>
         </w:rPr>
-        <w:t xml:space="preserve">Run scraper</w:t>
+        <w:t xml:space="preserve">no separate Run button</w:t>
+      </w:r>
+      <w:r>
+        <w:rPr/>
+        <w:t xml:space="preserve"> in the grid.</w:t>
+      </w:r>
+    </w:p>
+    <w:p>
+      <w:pPr>
+        <w:spacing w:lineRule="auto"/>
+      </w:pPr>
+      <w:r>
+        <w:rPr/>
+        <w:t xml:space="preserve">After login, you may see: </w:t>
+      </w:r>
+      <w:r>
+        <w:rPr/>
+        <w:t xml:space="preserve">Login OK. Device group &amp; admin counts are updated. Save the full group list to the database now?</w:t>
+      </w:r>
+      <w:r>
+        <w:rPr/>
+        <w:t xml:space="preserve"> → choose </w:t>
+      </w:r>
+      <w:r>
+        <w:rPr>
+          <w:b/>
+        </w:rPr>
+        <w:t xml:space="preserve">Scrape now</w:t>
       </w:r>
       <w:r>
         <w:rPr/>
@@ -8767,21 +8789,31 @@
       </w:pPr>
       <w:r>
         <w:rPr/>
-        <w:t xml:space="preserve">Empty list? Run </w:t>
+        <w:t xml:space="preserve">Empty list? </w:t>
       </w:r>
       <w:r>
         <w:rPr>
           <w:b/>
         </w:rPr>
-        <w:t xml:space="preserve">Run</w:t>
-      </w:r>
-      <w:r>
-        <w:rPr/>
-        <w:t xml:space="preserve"> scraper first. Message: </w:t>
-      </w:r>
-      <w:r>
-        <w:rPr/>
-        <w:t xml:space="preserve">No links. Run scraper first.</w:t>
+        <w:t xml:space="preserve">Sync</w:t>
+      </w:r>
+      <w:r>
+        <w:rPr/>
+        <w:t xml:space="preserve"> → </w:t>
+      </w:r>
+      <w:r>
+        <w:rPr>
+          <w:b/>
+        </w:rPr>
+        <w:t xml:space="preserve">Scrape now</w:t>
+      </w:r>
+      <w:r>
+        <w:rPr/>
+        <w:t xml:space="preserve"> first. Message: </w:t>
+      </w:r>
+      <w:r>
+        <w:rPr/>
+        <w:t xml:space="preserve">No links. Scrape via Sync first.</w:t>
       </w:r>
     </w:p>
     <w:p>
@@ -16727,20 +16759,28 @@
         <w:rPr>
           <w:b/>
         </w:rPr>
-        <w:t xml:space="preserve">1.0.17</w:t>
-      </w:r>
-      <w:r>
-        <w:rPr/>
-        <w:t xml:space="preserve">. Update this document when new features ship.</w:t>
-      </w:r>
-    </w:p>
-    <w:p>
-      <w:pPr>
-        <w:spacing w:lineRule="auto"/>
-      </w:pPr>
-      <w:r>
-        <w:rPr/>
-        <w:t xml:space="preserve">Internal use only — Resource Management v1.0.17</w:t>
+        <w:t xml:space="preserve">1.0.28</w:t>
+      </w:r>
+      <w:r>
+        <w:rPr/>
+        <w:t xml:space="preserve">. Ticket tab removed since 1.0.24; update PDF/Word after each release via </w:t>
+      </w:r>
+      <w:r>
+        <w:rPr/>
+        <w:t xml:space="preserve">npm run build:handbook-docs</w:t>
+      </w:r>
+      <w:r>
+        <w:rPr/>
+        <w:t xml:space="preserve">.</w:t>
+      </w:r>
+    </w:p>
+    <w:p>
+      <w:pPr>
+        <w:spacing w:lineRule="auto"/>
+      </w:pPr>
+      <w:r>
+        <w:rPr/>
+        <w:t xml:space="preserve">Internal use only — Resource Management v1.0.28</w:t>
       </w:r>
     </w:p>
   </w:body>

</xml_diff>

<commit_message>
Checkpoint UI Account/Operations sebelum optimasi core Sync, Scrape, dan Job Queue.
Perbarui insight header/KPI/slicer, metric CTA + setup Join/Leave, animasi modal, cache stock detail, serta penyesuaian terkait scrape/automation/docs.

Co-authored-by: Cursor <cursoragent@cursor.com>
</commit_message>
<xml_diff>
--- a/docs/guides/documents/EN/Resource-Management-User-Guide-EN.docx
+++ b/docs/guides/documents/EN/Resource-Management-User-Guide-EN.docx
@@ -146,7 +146,7 @@
             </w:pPr>
             <w:r>
               <w:rPr/>
-              <w:t xml:space="preserve">1.0.28</w:t>
+              <w:t xml:space="preserve">1.0.30</w:t>
             </w:r>
           </w:p>
         </w:tc>
@@ -413,7 +413,7 @@
           <w:rPr>
             <w:rStyle w:val="Hyperlink"/>
           </w:rPr>
-          <w:t xml:space="preserve">6. Reporting tab — join/admin matrix</w:t>
+          <w:t xml:space="preserve">6. Group matrix — join/admin (Account header)</w:t>
         </w:r>
       </w:hyperlink>
     </w:p>
@@ -725,7 +725,7 @@
           <w:rPr>
             <w:rStyle w:val="Hyperlink"/>
           </w:rPr>
-          <w:t xml:space="preserve">Reporting tab — join/admin matrix</w:t>
+          <w:t xml:space="preserve">Group matrix — join/admin (Account header)</w:t>
         </w:r>
       </w:hyperlink>
     </w:p>
@@ -3391,52 +3391,103 @@
             </w:pPr>
             <w:r>
               <w:rPr/>
-              <w:t xml:space="preserve">Brand cards &amp; WA/TG account rows</w:t>
-            </w:r>
-          </w:p>
-        </w:tc>
-      </w:tr>
-      <w:tr>
-        <w:trPr>
-          <w:cantSplit/>
-        </w:trPr>
-        <w:tc>
-          <w:tcPr>
-            <w:tcBorders>
-              <w:top w:val="single" w:sz="1" w:space="0" w:color="000000"/>
-              <w:bottom w:val="single" w:sz="1" w:space="0" w:color="000000"/>
-              <w:left w:val="single" w:sz="1" w:space="0" w:color="000000"/>
-              <w:right w:val="single" w:sz="1" w:space="0" w:color="000000"/>
-            </w:tcBorders>
-          </w:tcPr>
-          <w:p>
-            <w:pPr>
-              <w:spacing w:lineRule="auto"/>
-            </w:pPr>
-            <w:r>
-              <w:rPr>
-                <w:b/>
-              </w:rPr>
-              <w:t xml:space="preserve">Ticket</w:t>
-            </w:r>
-          </w:p>
-        </w:tc>
-        <w:tc>
-          <w:tcPr>
-            <w:tcBorders>
-              <w:top w:val="single" w:sz="1" w:space="0" w:color="000000"/>
-              <w:bottom w:val="single" w:sz="1" w:space="0" w:color="000000"/>
-              <w:left w:val="single" w:sz="1" w:space="0" w:color="000000"/>
-              <w:right w:val="single" w:sz="1" w:space="0" w:color="000000"/>
-            </w:tcBorders>
-          </w:tcPr>
-          <w:p>
-            <w:pPr>
-              <w:spacing w:lineRule="auto"/>
-            </w:pPr>
-            <w:r>
-              <w:rPr/>
-              <w:t xml:space="preserve">Open issues to remediate (badge = open issue count)</w:t>
+              <w:t xml:space="preserve">Brand cards, WA/TG rows, KPI issues, </w:t>
+            </w:r>
+          </w:p>
+          <w:p>
+            <w:pPr>
+              <w:spacing w:lineRule="auto"/>
+            </w:pPr>
+            <w:r>
+              <w:rPr>
+                <w:b/>
+              </w:rPr>
+              <w:t xml:space="preserve">stock chips</w:t>
+            </w:r>
+          </w:p>
+          <w:p>
+            <w:pPr>
+              <w:spacing w:lineRule="auto"/>
+            </w:pPr>
+            <w:r>
+              <w:rPr/>
+              <w:t xml:space="preserve"> + </w:t>
+            </w:r>
+          </w:p>
+          <w:p>
+            <w:pPr>
+              <w:spacing w:lineRule="auto"/>
+            </w:pPr>
+            <w:r>
+              <w:rPr>
+                <w:b/>
+              </w:rPr>
+              <w:t xml:space="preserve">Group matrix</w:t>
+            </w:r>
+          </w:p>
+          <w:p>
+            <w:pPr>
+              <w:spacing w:lineRule="auto"/>
+            </w:pPr>
+            <w:r>
+              <w:rPr/>
+              <w:t xml:space="preserve"> (card header)</w:t>
+            </w:r>
+          </w:p>
+        </w:tc>
+      </w:tr>
+      <w:tr>
+        <w:trPr>
+          <w:cantSplit/>
+        </w:trPr>
+        <w:tc>
+          <w:tcPr>
+            <w:tcBorders>
+              <w:top w:val="single" w:sz="1" w:space="0" w:color="000000"/>
+              <w:bottom w:val="single" w:sz="1" w:space="0" w:color="000000"/>
+              <w:left w:val="single" w:sz="1" w:space="0" w:color="000000"/>
+              <w:right w:val="single" w:sz="1" w:space="0" w:color="000000"/>
+            </w:tcBorders>
+          </w:tcPr>
+          <w:p>
+            <w:pPr>
+              <w:spacing w:lineRule="auto"/>
+            </w:pPr>
+            <w:r>
+              <w:rPr>
+                <w:b/>
+              </w:rPr>
+              <w:t xml:space="preserve">Operations</w:t>
+            </w:r>
+          </w:p>
+        </w:tc>
+        <w:tc>
+          <w:tcPr>
+            <w:tcBorders>
+              <w:top w:val="single" w:sz="1" w:space="0" w:color="000000"/>
+              <w:bottom w:val="single" w:sz="1" w:space="0" w:color="000000"/>
+              <w:left w:val="single" w:sz="1" w:space="0" w:color="000000"/>
+              <w:right w:val="single" w:sz="1" w:space="0" w:color="000000"/>
+            </w:tcBorders>
+          </w:tcPr>
+          <w:p>
+            <w:pPr>
+              <w:spacing w:lineRule="auto"/>
+            </w:pPr>
+            <w:r>
+              <w:rPr>
+                <w:b/>
+              </w:rPr>
+              <w:t xml:space="preserve">Job Queue</w:t>
+            </w:r>
+          </w:p>
+          <w:p>
+            <w:pPr>
+              <w:spacing w:lineRule="auto"/>
+            </w:pPr>
+            <w:r>
+              <w:rPr/>
+              <w:t xml:space="preserve"> only (join / create / set admin / exit-delete / set photo)</w:t>
             </w:r>
           </w:p>
         </w:tc>
@@ -3448,6 +3499,37 @@
       </w:pPr>
       <w:r>
         <w:rPr/>
+      </w:r>
+    </w:p>
+    <w:p>
+      <w:pPr>
+        <w:ind w:left="284"/>
+        <w:jc w:val="both"/>
+        <w:spacing w:lineRule="auto"/>
+      </w:pPr>
+      <w:r>
+        <w:rPr/>
+        <w:t xml:space="preserve">There is </w:t>
+      </w:r>
+      <w:r>
+        <w:rPr>
+          <w:b/>
+        </w:rPr>
+        <w:t xml:space="preserve">no</w:t>
+      </w:r>
+      <w:r>
+        <w:rPr/>
+        <w:t xml:space="preserve"> separate Reporting tab. Open the join/admin matrix from the </w:t>
+      </w:r>
+      <w:r>
+        <w:rPr>
+          <w:b/>
+        </w:rPr>
+        <w:t xml:space="preserve">group count badge</w:t>
+      </w:r>
+      <w:r>
+        <w:rPr/>
+        <w:t xml:space="preserve"> on the Account brand card header. Stock chips live on the same header (not an Operations Overview bookmark).</w:t>
       </w:r>
     </w:p>
     <w:p>
@@ -11911,16 +11993,44 @@
       </w:pPr>
       <w:r>
         <w:rPr/>
-        <w:t xml:space="preserve">6. Reporting tab — join/admin matrix</w:t>
-      </w:r>
-    </w:p>
-    <w:p>
-      <w:pPr>
-        <w:spacing w:lineRule="auto"/>
-      </w:pPr>
-      <w:r>
-        <w:rPr/>
-        <w:t xml:space="preserve">Read-only — does not change sessions, scraper, or tickets.</w:t>
+        <w:t xml:space="preserve">6. Group matrix — join/admin (Account header)</w:t>
+      </w:r>
+    </w:p>
+    <w:p>
+      <w:pPr>
+        <w:spacing w:lineRule="auto"/>
+      </w:pPr>
+      <w:r>
+        <w:rPr/>
+        <w:t xml:space="preserve">The Reporting tab shell was </w:t>
+      </w:r>
+      <w:r>
+        <w:rPr>
+          <w:b/>
+        </w:rPr>
+        <w:t xml:space="preserve">removed</w:t>
+      </w:r>
+      <w:r>
+        <w:rPr/>
+        <w:t xml:space="preserve">. Join/admin matrix opens from the Account brand card </w:t>
+      </w:r>
+      <w:r>
+        <w:rPr>
+          <w:b/>
+        </w:rPr>
+        <w:t xml:space="preserve">group count badge</w:t>
+      </w:r>
+      <w:r>
+        <w:rPr/>
+        <w:t xml:space="preserve"> (</w:t>
+      </w:r>
+      <w:r>
+        <w:rPr/>
+        <w:t xml:space="preserve">BrandMasterGroupsModal</w:t>
+      </w:r>
+      <w:r>
+        <w:rPr/>
+        <w:t xml:space="preserve">) — read-only.</w:t>
       </w:r>
     </w:p>
     <w:tbl>
@@ -11963,7 +12073,7 @@
             </w:pPr>
             <w:r>
               <w:rPr/>
-              <w:t xml:space="preserve">Filter</w:t>
+              <w:t xml:space="preserve">Control</w:t>
             </w:r>
           </w:p>
         </w:tc>
@@ -12009,130 +12119,27 @@
               <w:spacing w:lineRule="auto"/>
             </w:pPr>
             <w:r>
-              <w:rPr>
-                <w:b/>
-              </w:rPr>
-              <w:t xml:space="preserve">Platform</w:t>
-            </w:r>
-          </w:p>
-        </w:tc>
-        <w:tc>
-          <w:tcPr>
-            <w:tcBorders>
-              <w:top w:val="single" w:sz="1" w:space="0" w:color="000000"/>
-              <w:bottom w:val="single" w:sz="1" w:space="0" w:color="000000"/>
-              <w:left w:val="single" w:sz="1" w:space="0" w:color="000000"/>
-              <w:right w:val="single" w:sz="1" w:space="0" w:color="000000"/>
-            </w:tcBorders>
-          </w:tcPr>
-          <w:p>
-            <w:pPr>
-              <w:spacing w:lineRule="auto"/>
-            </w:pPr>
-            <w:r>
-              <w:rPr/>
-              <w:t xml:space="preserve">WhatsApp or Telegram</w:t>
-            </w:r>
-          </w:p>
-        </w:tc>
-      </w:tr>
-      <w:tr>
-        <w:trPr>
-          <w:cantSplit/>
-        </w:trPr>
-        <w:tc>
-          <w:tcPr>
-            <w:tcBorders>
-              <w:top w:val="single" w:sz="1" w:space="0" w:color="000000"/>
-              <w:bottom w:val="single" w:sz="1" w:space="0" w:color="000000"/>
-              <w:left w:val="single" w:sz="1" w:space="0" w:color="000000"/>
-              <w:right w:val="single" w:sz="1" w:space="0" w:color="000000"/>
-            </w:tcBorders>
-          </w:tcPr>
-          <w:p>
-            <w:pPr>
-              <w:spacing w:lineRule="auto"/>
-            </w:pPr>
-            <w:r>
-              <w:rPr>
-                <w:b/>
-              </w:rPr>
-              <w:t xml:space="preserve">Brand</w:t>
-            </w:r>
-          </w:p>
-        </w:tc>
-        <w:tc>
-          <w:tcPr>
-            <w:tcBorders>
-              <w:top w:val="single" w:sz="1" w:space="0" w:color="000000"/>
-              <w:bottom w:val="single" w:sz="1" w:space="0" w:color="000000"/>
-              <w:left w:val="single" w:sz="1" w:space="0" w:color="000000"/>
-              <w:right w:val="single" w:sz="1" w:space="0" w:color="000000"/>
-            </w:tcBorders>
-          </w:tcPr>
-          <w:p>
-            <w:pPr>
-              <w:spacing w:lineRule="auto"/>
-            </w:pPr>
-            <w:r>
-              <w:rPr/>
-              <w:t xml:space="preserve">Brand with accounts</w:t>
-            </w:r>
-          </w:p>
-        </w:tc>
-      </w:tr>
-      <w:tr>
-        <w:trPr>
-          <w:cantSplit/>
-        </w:trPr>
-        <w:tc>
-          <w:tcPr>
-            <w:tcBorders>
-              <w:top w:val="single" w:sz="1" w:space="0" w:color="000000"/>
-              <w:bottom w:val="single" w:sz="1" w:space="0" w:color="000000"/>
-              <w:left w:val="single" w:sz="1" w:space="0" w:color="000000"/>
-              <w:right w:val="single" w:sz="1" w:space="0" w:color="000000"/>
-            </w:tcBorders>
-          </w:tcPr>
-          <w:p>
-            <w:pPr>
-              <w:spacing w:lineRule="auto"/>
-            </w:pPr>
-            <w:r>
-              <w:rPr>
-                <w:b/>
-              </w:rPr>
-              <w:t xml:space="preserve">Acc Name</w:t>
-            </w:r>
-          </w:p>
-        </w:tc>
-        <w:tc>
-          <w:tcPr>
-            <w:tcBorders>
-              <w:top w:val="single" w:sz="1" w:space="0" w:color="000000"/>
-              <w:bottom w:val="single" w:sz="1" w:space="0" w:color="000000"/>
-              <w:left w:val="single" w:sz="1" w:space="0" w:color="000000"/>
-              <w:right w:val="single" w:sz="1" w:space="0" w:color="000000"/>
-            </w:tcBorders>
-          </w:tcPr>
-          <w:p>
-            <w:pPr>
-              <w:spacing w:lineRule="auto"/>
-            </w:pPr>
-            <w:r>
-              <w:rPr>
-                <w:b/>
-              </w:rPr>
-              <w:t xml:space="preserve">All</w:t>
-            </w:r>
-          </w:p>
-          <w:p>
-            <w:pPr>
-              <w:spacing w:lineRule="auto"/>
-            </w:pPr>
-            <w:r>
-              <w:rPr/>
-              <w:t xml:space="preserve"> = matrix for all accounts; one account = single-account report</w:t>
+              <w:rPr/>
+              <w:t xml:space="preserve">Entry</w:t>
+            </w:r>
+          </w:p>
+        </w:tc>
+        <w:tc>
+          <w:tcPr>
+            <w:tcBorders>
+              <w:top w:val="single" w:sz="1" w:space="0" w:color="000000"/>
+              <w:bottom w:val="single" w:sz="1" w:space="0" w:color="000000"/>
+              <w:left w:val="single" w:sz="1" w:space="0" w:color="000000"/>
+              <w:right w:val="single" w:sz="1" w:space="0" w:color="000000"/>
+            </w:tcBorders>
+          </w:tcPr>
+          <w:p>
+            <w:pPr>
+              <w:spacing w:lineRule="auto"/>
+            </w:pPr>
+            <w:r>
+              <w:rPr/>
+              <w:t xml:space="preserve">Account → brand card header → group count</w:t>
             </w:r>
           </w:p>
         </w:tc>
@@ -12177,52 +12184,93 @@
             </w:pPr>
             <w:r>
               <w:rPr/>
-              <w:t xml:space="preserve">Join status or admin status vs master</w:t>
-            </w:r>
-          </w:p>
-        </w:tc>
-      </w:tr>
-      <w:tr>
-        <w:trPr>
-          <w:cantSplit/>
-        </w:trPr>
-        <w:tc>
-          <w:tcPr>
-            <w:tcBorders>
-              <w:top w:val="single" w:sz="1" w:space="0" w:color="000000"/>
-              <w:bottom w:val="single" w:sz="1" w:space="0" w:color="000000"/>
-              <w:left w:val="single" w:sz="1" w:space="0" w:color="000000"/>
-              <w:right w:val="single" w:sz="1" w:space="0" w:color="000000"/>
-            </w:tcBorders>
-          </w:tcPr>
-          <w:p>
-            <w:pPr>
-              <w:spacing w:lineRule="auto"/>
-            </w:pPr>
-            <w:r>
-              <w:rPr>
-                <w:b/>
-              </w:rPr>
-              <w:t xml:space="preserve">Search group name</w:t>
-            </w:r>
-          </w:p>
-        </w:tc>
-        <w:tc>
-          <w:tcPr>
-            <w:tcBorders>
-              <w:top w:val="single" w:sz="1" w:space="0" w:color="000000"/>
-              <w:bottom w:val="single" w:sz="1" w:space="0" w:color="000000"/>
-              <w:left w:val="single" w:sz="1" w:space="0" w:color="000000"/>
-              <w:right w:val="single" w:sz="1" w:space="0" w:color="000000"/>
-            </w:tcBorders>
-          </w:tcPr>
-          <w:p>
-            <w:pPr>
-              <w:spacing w:lineRule="auto"/>
-            </w:pPr>
-            <w:r>
-              <w:rPr/>
-              <w:t xml:space="preserve">Filter by group name</w:t>
+              <w:t xml:space="preserve">Join or admin Yes/No vs master (all accounts on that brand+platform)</w:t>
+            </w:r>
+          </w:p>
+        </w:tc>
+      </w:tr>
+      <w:tr>
+        <w:trPr>
+          <w:cantSplit/>
+        </w:trPr>
+        <w:tc>
+          <w:tcPr>
+            <w:tcBorders>
+              <w:top w:val="single" w:sz="1" w:space="0" w:color="000000"/>
+              <w:bottom w:val="single" w:sz="1" w:space="0" w:color="000000"/>
+              <w:left w:val="single" w:sz="1" w:space="0" w:color="000000"/>
+              <w:right w:val="single" w:sz="1" w:space="0" w:color="000000"/>
+            </w:tcBorders>
+          </w:tcPr>
+          <w:p>
+            <w:pPr>
+              <w:spacing w:lineRule="auto"/>
+            </w:pPr>
+            <w:r>
+              <w:rPr/>
+              <w:t xml:space="preserve">Search / Status</w:t>
+            </w:r>
+          </w:p>
+        </w:tc>
+        <w:tc>
+          <w:tcPr>
+            <w:tcBorders>
+              <w:top w:val="single" w:sz="1" w:space="0" w:color="000000"/>
+              <w:bottom w:val="single" w:sz="1" w:space="0" w:color="000000"/>
+              <w:left w:val="single" w:sz="1" w:space="0" w:color="000000"/>
+              <w:right w:val="single" w:sz="1" w:space="0" w:color="000000"/>
+            </w:tcBorders>
+          </w:tcPr>
+          <w:p>
+            <w:pPr>
+              <w:spacing w:lineRule="auto"/>
+            </w:pPr>
+            <w:r>
+              <w:rPr/>
+              <w:t xml:space="preserve">Filter by name / stock status</w:t>
+            </w:r>
+          </w:p>
+        </w:tc>
+      </w:tr>
+      <w:tr>
+        <w:trPr>
+          <w:cantSplit/>
+        </w:trPr>
+        <w:tc>
+          <w:tcPr>
+            <w:tcBorders>
+              <w:top w:val="single" w:sz="1" w:space="0" w:color="000000"/>
+              <w:bottom w:val="single" w:sz="1" w:space="0" w:color="000000"/>
+              <w:left w:val="single" w:sz="1" w:space="0" w:color="000000"/>
+              <w:right w:val="single" w:sz="1" w:space="0" w:color="000000"/>
+            </w:tcBorders>
+          </w:tcPr>
+          <w:p>
+            <w:pPr>
+              <w:spacing w:lineRule="auto"/>
+            </w:pPr>
+            <w:r>
+              <w:rPr/>
+              <w:t xml:space="preserve">Column filter</w:t>
+            </w:r>
+          </w:p>
+        </w:tc>
+        <w:tc>
+          <w:tcPr>
+            <w:tcBorders>
+              <w:top w:val="single" w:sz="1" w:space="0" w:color="000000"/>
+              <w:bottom w:val="single" w:sz="1" w:space="0" w:color="000000"/>
+              <w:left w:val="single" w:sz="1" w:space="0" w:color="000000"/>
+              <w:right w:val="single" w:sz="1" w:space="0" w:color="000000"/>
+            </w:tcBorders>
+          </w:tcPr>
+          <w:p>
+            <w:pPr>
+              <w:spacing w:lineRule="auto"/>
+            </w:pPr>
+            <w:r>
+              <w:rPr/>
+              <w:t xml:space="preserve">Yes / No / All on account headers</w:t>
             </w:r>
           </w:p>
         </w:tc>
@@ -12241,43 +12289,16 @@
         <w:spacing w:lineRule="auto"/>
       </w:pPr>
       <w:r>
-        <w:rPr>
-          <w:b/>
-        </w:rPr>
-        <w:t xml:space="preserve">Matrix (Acc Name = All):</w:t>
-      </w:r>
-      <w:r>
-        <w:rPr/>
-        <w:t xml:space="preserve"> master rows × account columns (Yes/No). Column header dropdown: Yes / No / All. If filter returns no rows, table headers stay visible — click </w:t>
-      </w:r>
-      <w:r>
-        <w:rPr>
-          <w:b/>
-        </w:rPr>
-        <w:t xml:space="preserve">Back to all groups</w:t>
-      </w:r>
-      <w:r>
-        <w:rPr/>
-        <w:t xml:space="preserve"> or choose </w:t>
-      </w:r>
-      <w:r>
-        <w:rPr>
-          <w:b/>
-        </w:rPr>
-        <w:t xml:space="preserve">All</w:t>
-      </w:r>
-      <w:r>
-        <w:rPr/>
-        <w:t xml:space="preserve">.</w:t>
-      </w:r>
-    </w:p>
-    <w:p>
-      <w:pPr>
-        <w:spacing w:lineRule="auto"/>
-      </w:pPr>
-      <w:r>
-        <w:rPr/>
-        <w:t xml:space="preserve">Updates automatically after scrape or Supabase changes (realtime).</w:t>
+        <w:rPr/>
+        <w:t xml:space="preserve">Updates automatically after scrape or Supabase changes (</w:t>
+      </w:r>
+      <w:r>
+        <w:rPr/>
+        <w:t xml:space="preserve">rm-reporting-reload</w:t>
+      </w:r>
+      <w:r>
+        <w:rPr/>
+        <w:t xml:space="preserve">).</w:t>
       </w:r>
     </w:p>
     <w:p>
@@ -16759,11 +16780,11 @@
         <w:rPr>
           <w:b/>
         </w:rPr>
-        <w:t xml:space="preserve">1.0.28</w:t>
-      </w:r>
-      <w:r>
-        <w:rPr/>
-        <w:t xml:space="preserve">. Ticket tab removed since 1.0.24; update PDF/Word after each release via </w:t>
+        <w:t xml:space="preserve">1.0.30</w:t>
+      </w:r>
+      <w:r>
+        <w:rPr/>
+        <w:t xml:space="preserve">. Update PDF/Word after each release via </w:t>
       </w:r>
       <w:r>
         <w:rPr/>
@@ -16780,7 +16801,7 @@
       </w:pPr>
       <w:r>
         <w:rPr/>
-        <w:t xml:space="preserve">Internal use only — Resource Management v1.0.28</w:t>
+        <w:t xml:space="preserve">Internal use only — Resource Management v1.0.30</w:t>
       </w:r>
     </w:p>
   </w:body>

</xml_diff>

<commit_message>
Release v1.0.33: Sync/Job mutual block and docs sync.
Block Job Queue dispatch while an account holds any execute slot (including Checking Session); await WA session validate; align worker Leave defaults and validators; bump guides/installers to 1.0.33.

Co-authored-by: Cursor <cursoragent@cursor.com>
</commit_message>
<xml_diff>
--- a/docs/guides/documents/EN/Resource-Management-User-Guide-EN.docx
+++ b/docs/guides/documents/EN/Resource-Management-User-Guide-EN.docx
@@ -146,7 +146,7 @@
             </w:pPr>
             <w:r>
               <w:rPr/>
-              <w:t xml:space="preserve">1.0.32</w:t>
+              <w:t xml:space="preserve">1.0.33</w:t>
             </w:r>
           </w:p>
         </w:tc>
@@ -577,11 +577,21 @@
         <w:rPr>
           <w:b/>
         </w:rPr>
-        <w:t xml:space="preserve">v1.0.32:</w:t>
-      </w:r>
-      <w:r>
-        <w:rPr/>
-        <w:t xml:space="preserve"> Full scrape reads </w:t>
+        <w:t xml:space="preserve">v1.0.33:</w:t>
+      </w:r>
+      <w:r>
+        <w:rPr/>
+        <w:t xml:space="preserve"> Sync and Job Queue </w:t>
+      </w:r>
+      <w:r>
+        <w:rPr>
+          <w:b/>
+        </w:rPr>
+        <w:t xml:space="preserve">block each other</w:t>
+      </w:r>
+      <w:r>
+        <w:rPr/>
+        <w:t xml:space="preserve"> on the same account (including Checking Session). Full scrape reads </w:t>
       </w:r>
       <w:r>
         <w:rPr>
@@ -17643,7 +17653,7 @@
         <w:rPr>
           <w:b/>
         </w:rPr>
-        <w:t xml:space="preserve">1.0.32</w:t>
+        <w:t xml:space="preserve">1.0.33</w:t>
       </w:r>
       <w:r>
         <w:rPr/>
@@ -17664,7 +17674,7 @@
       </w:pPr>
       <w:r>
         <w:rPr/>
-        <w:t xml:space="preserve">Internal use only — Resource Management v1.0.32</w:t>
+        <w:t xml:space="preserve">Internal use only — Resource Management v1.0.33</w:t>
       </w:r>
     </w:p>
   </w:body>

</xml_diff>

<commit_message>
Release v1.0.34: Telegram basic-chat Job Queue, Super Group matrix filter, and docs sync.
Bump app to 1.0.34; sync install guides, handbook EN/ZH (PDF/Word/HTML), panduan Confluence, and master reference for TG basic Chat Set admin/Leave/Delete, AuthKeyDuplicated re-login, Super Group Yes/No matrix filter, Job Queue harden, and daily is_owner.

Co-authored-by: Cursor <cursoragent@cursor.com>
</commit_message>
<xml_diff>
--- a/docs/guides/documents/EN/Resource-Management-User-Guide-EN.docx
+++ b/docs/guides/documents/EN/Resource-Management-User-Guide-EN.docx
@@ -146,7 +146,7 @@
             </w:pPr>
             <w:r>
               <w:rPr/>
-              <w:t xml:space="preserve">1.0.33</w:t>
+              <w:t xml:space="preserve">1.0.34</w:t>
             </w:r>
           </w:p>
         </w:tc>
@@ -577,31 +577,71 @@
         <w:rPr>
           <w:b/>
         </w:rPr>
-        <w:t xml:space="preserve">v1.0.33:</w:t>
-      </w:r>
-      <w:r>
-        <w:rPr/>
-        <w:t xml:space="preserve"> Sync and Job Queue </w:t>
+        <w:t xml:space="preserve">v1.0.34:</w:t>
+      </w:r>
+      <w:r>
+        <w:rPr/>
+        <w:t xml:space="preserve"> Telegram Job Queue </w:t>
       </w:r>
       <w:r>
         <w:rPr>
           <w:b/>
         </w:rPr>
-        <w:t xml:space="preserve">block each other</w:t>
-      </w:r>
-      <w:r>
-        <w:rPr/>
-        <w:t xml:space="preserve"> on the same account (including Checking Session). Full scrape reads </w:t>
+        <w:t xml:space="preserve">Set admin / Leave / Delete</w:t>
+      </w:r>
+      <w:r>
+        <w:rPr/>
+        <w:t xml:space="preserve"> works on </w:t>
       </w:r>
       <w:r>
         <w:rPr>
           <w:b/>
         </w:rPr>
-        <w:t xml:space="preserve">only groups still on the account</w:t>
-      </w:r>
-      <w:r>
-        <w:rPr/>
-        <w:t xml:space="preserve"> (progress = real count after Leave/Delete). Job Queue partial batch → </w:t>
+        <w:t xml:space="preserve">basic groups</w:t>
+      </w:r>
+      <w:r>
+        <w:rPr/>
+        <w:t xml:space="preserve"> (Super Group = No), not only Super Groups/channels. Telegram </w:t>
+      </w:r>
+      <w:r>
+        <w:rPr>
+          <w:b/>
+        </w:rPr>
+        <w:t xml:space="preserve">AuthKeyDuplicated</w:t>
+      </w:r>
+      <w:r>
+        <w:rPr/>
+        <w:t xml:space="preserve"> (portable session used on another PC/IP) → session dead — </w:t>
+      </w:r>
+      <w:r>
+        <w:rPr>
+          <w:b/>
+        </w:rPr>
+        <w:t xml:space="preserve">log in again with QR</w:t>
+      </w:r>
+      <w:r>
+        <w:rPr/>
+        <w:t xml:space="preserve">. Group matrix </w:t>
+      </w:r>
+      <w:r>
+        <w:rPr>
+          <w:b/>
+        </w:rPr>
+        <w:t xml:space="preserve">Super Group</w:t>
+      </w:r>
+      <w:r>
+        <w:rPr/>
+        <w:t xml:space="preserve"> column filterable Yes/No (same as account columns). Job Queue join/leave/delete more resilient (transport retry, mid-batch outcomes, safer cancel). Daily scrape stores </w:t>
+      </w:r>
+      <w:r>
+        <w:rPr>
+          <w:b/>
+        </w:rPr>
+        <w:t xml:space="preserve">is_owner</w:t>
+      </w:r>
+      <w:r>
+        <w:rPr/>
+        <w:t xml:space="preserve">. Sync↔Job still block each other; scrape reads only groups still on the account; partial Job Queue batch → </w:t>
       </w:r>
       <w:r>
         <w:rPr>
@@ -611,73 +651,7 @@
       </w:r>
       <w:r>
         <w:rPr/>
-        <w:t xml:space="preserve"> (not green Completed). There is </w:t>
-      </w:r>
-      <w:r>
-        <w:rPr>
-          <w:b/>
-        </w:rPr>
-        <w:t xml:space="preserve">no Ticket tab</w:t>
-      </w:r>
-      <w:r>
-        <w:rPr/>
-        <w:t xml:space="preserve">. Issues appear on the </w:t>
-      </w:r>
-      <w:r>
-        <w:rPr>
-          <w:b/>
-        </w:rPr>
-        <w:t xml:space="preserve">Account</w:t>
-      </w:r>
-      <w:r>
-        <w:rPr/>
-        <w:t xml:space="preserve"> tab (not-aligned badges: Junk / Missing / Not admin). Remediation runs through </w:t>
-      </w:r>
-      <w:r>
-        <w:rPr>
-          <w:b/>
-        </w:rPr>
-        <w:t xml:space="preserve">Operations → Job Queue</w:t>
-      </w:r>
-      <w:r>
-        <w:rPr/>
-        <w:t xml:space="preserve"> (SETUP: join / set admin / exit). </w:t>
-      </w:r>
-      <w:r>
-        <w:rPr>
-          <w:b/>
-        </w:rPr>
-        <w:t xml:space="preserve">Operations</w:t>
-      </w:r>
-      <w:r>
-        <w:rPr/>
-        <w:t xml:space="preserve"> is Job Queue only (no Overview). Stock chips and the Group matrix live on the Account brand header. Prefer sidebar </w:t>
-      </w:r>
-      <w:r>
-        <w:rPr>
-          <w:b/>
-        </w:rPr>
-        <w:t xml:space="preserve">Settings</w:t>
-      </w:r>
-      <w:r>
-        <w:rPr/>
-        <w:t xml:space="preserve"> (</w:t>
-      </w:r>
-      <w:r>
-        <w:rPr/>
-        <w:t xml:space="preserve">/settings</w:t>
-      </w:r>
-      <w:r>
-        <w:rPr/>
-        <w:t xml:space="preserve">); </w:t>
-      </w:r>
-      <w:r>
-        <w:rPr/>
-        <w:t xml:space="preserve">/admin</w:t>
-      </w:r>
-      <w:r>
-        <w:rPr/>
-        <w:t xml:space="preserve"> redirects there.</w:t>
+        <w:t xml:space="preserve">.</w:t>
       </w:r>
     </w:p>
     <w:p>
@@ -11154,7 +11128,7 @@
             </w:pPr>
             <w:r>
               <w:rPr/>
-              <w:t xml:space="preserve">Column filter</w:t>
+              <w:t xml:space="preserve">Column filter (account)</w:t>
             </w:r>
           </w:p>
         </w:tc>
@@ -11174,6 +11148,80 @@
             <w:r>
               <w:rPr/>
               <w:t xml:space="preserve">Yes / No / All on account headers</w:t>
+            </w:r>
+          </w:p>
+        </w:tc>
+      </w:tr>
+      <w:tr>
+        <w:trPr>
+          <w:cantSplit/>
+        </w:trPr>
+        <w:tc>
+          <w:tcPr>
+            <w:tcBorders>
+              <w:top w:val="single" w:sz="1" w:space="0" w:color="000000"/>
+              <w:bottom w:val="single" w:sz="1" w:space="0" w:color="000000"/>
+              <w:left w:val="single" w:sz="1" w:space="0" w:color="000000"/>
+              <w:right w:val="single" w:sz="1" w:space="0" w:color="000000"/>
+            </w:tcBorders>
+          </w:tcPr>
+          <w:p>
+            <w:pPr>
+              <w:spacing w:lineRule="auto"/>
+            </w:pPr>
+            <w:r>
+              <w:rPr>
+                <w:b/>
+              </w:rPr>
+              <w:t xml:space="preserve">Super Group</w:t>
+            </w:r>
+          </w:p>
+          <w:p>
+            <w:pPr>
+              <w:spacing w:lineRule="auto"/>
+            </w:pPr>
+            <w:r>
+              <w:rPr/>
+              <w:t xml:space="preserve"> filter</w:t>
+            </w:r>
+          </w:p>
+        </w:tc>
+        <w:tc>
+          <w:tcPr>
+            <w:tcBorders>
+              <w:top w:val="single" w:sz="1" w:space="0" w:color="000000"/>
+              <w:bottom w:val="single" w:sz="1" w:space="0" w:color="000000"/>
+              <w:left w:val="single" w:sz="1" w:space="0" w:color="000000"/>
+              <w:right w:val="single" w:sz="1" w:space="0" w:color="000000"/>
+            </w:tcBorders>
+          </w:tcPr>
+          <w:p>
+            <w:pPr>
+              <w:spacing w:lineRule="auto"/>
+            </w:pPr>
+            <w:r>
+              <w:rPr/>
+              <w:t xml:space="preserve">Yes / No / All (Telegram: </w:t>
+            </w:r>
+          </w:p>
+          <w:p>
+            <w:pPr>
+              <w:spacing w:lineRule="auto"/>
+            </w:pPr>
+            <w:r>
+              <w:rPr>
+                <w:highlight w:val="lightGray"/>
+              </w:rPr>
+              <w:t xml:space="preserve">-100…</w:t>
+            </w:r>
+          </w:p>
+          <w:p>
+            <w:pPr>
+              <w:spacing w:lineRule="auto"/>
+            </w:pPr>
+            <w:r>
+              <w:rPr/>
+              <w:t xml:space="preserve"> id heuristic)</w:t>
             </w:r>
           </w:p>
         </w:tc>
@@ -17653,7 +17701,7 @@
         <w:rPr>
           <w:b/>
         </w:rPr>
-        <w:t xml:space="preserve">1.0.33</w:t>
+        <w:t xml:space="preserve">1.0.34</w:t>
       </w:r>
       <w:r>
         <w:rPr/>
@@ -17674,7 +17722,7 @@
       </w:pPr>
       <w:r>
         <w:rPr/>
-        <w:t xml:space="preserve">Internal use only — Resource Management v1.0.33</w:t>
+        <w:t xml:space="preserve">Internal use only — Resource Management v1.0.34</w:t>
       </w:r>
     </w:p>
   </w:body>

</xml_diff>